<commit_message>
Feat: Correct the P4 report
</commit_message>
<xml_diff>
--- a/Ontrack_Files/P4/P4_report.docx
+++ b/Ontrack_Files/P4/P4_report.docx
@@ -355,18 +355,7 @@
           <w:szCs w:val="23"/>
           <w14:ligatures w14:val="none"/>
         </w:rPr>
-        <w:t xml:space="preserve"> the dominant term in </w:t>
-      </w:r>
-      <w:r>
-        <w:rPr>
-          <w:rFonts w:ascii="Open Sans" w:eastAsia="Times New Roman" w:hAnsi="Open Sans" w:cs="Open Sans"/>
-          <w:color w:val="222222"/>
-          <w:kern w:val="0"/>
-          <w:sz w:val="23"/>
-          <w:szCs w:val="23"/>
-          <w14:ligatures w14:val="none"/>
-        </w:rPr>
-        <w:t>(n-</w:t>
+        <w:t xml:space="preserve"> the dominant term in (n-</w:t>
       </w:r>
       <w:proofErr w:type="gramStart"/>
       <w:r>
@@ -390,29 +379,7 @@
           <w:szCs w:val="23"/>
           <w14:ligatures w14:val="none"/>
         </w:rPr>
-        <w:t>n / 2</w:t>
-      </w:r>
-      <w:r>
-        <w:rPr>
-          <w:rFonts w:ascii="Open Sans" w:eastAsia="Times New Roman" w:hAnsi="Open Sans" w:cs="Open Sans"/>
-          <w:color w:val="222222"/>
-          <w:kern w:val="0"/>
-          <w:sz w:val="23"/>
-          <w:szCs w:val="23"/>
-          <w14:ligatures w14:val="none"/>
-        </w:rPr>
-        <w:t xml:space="preserve"> is </w:t>
-      </w:r>
-      <w:r>
-        <w:rPr>
-          <w:rFonts w:ascii="Open Sans" w:eastAsia="Times New Roman" w:hAnsi="Open Sans" w:cs="Open Sans"/>
-          <w:color w:val="222222"/>
-          <w:kern w:val="0"/>
-          <w:sz w:val="23"/>
-          <w:szCs w:val="23"/>
-          <w14:ligatures w14:val="none"/>
-        </w:rPr>
-        <w:t>n</w:t>
+        <w:t>n / 2 is n</w:t>
       </w:r>
       <w:proofErr w:type="gramStart"/>
       <w:r>
@@ -975,42 +942,56 @@
           <w:szCs w:val="23"/>
           <w14:ligatures w14:val="none"/>
         </w:rPr>
-        <w:t>O(n</w:t>
-      </w:r>
-      <w:r>
-        <w:rPr>
-          <w:rFonts w:ascii="Open Sans" w:eastAsia="Times New Roman" w:hAnsi="Open Sans" w:cs="Open Sans"/>
-          <w:color w:val="222222"/>
-          <w:kern w:val="0"/>
-          <w:sz w:val="23"/>
-          <w:szCs w:val="23"/>
-          <w:vertAlign w:val="superscript"/>
-          <w14:ligatures w14:val="none"/>
-        </w:rPr>
-        <w:t>2</w:t>
-      </w:r>
-      <w:r>
-        <w:rPr>
-          <w:rFonts w:ascii="Open Sans" w:eastAsia="Times New Roman" w:hAnsi="Open Sans" w:cs="Open Sans"/>
-          <w:color w:val="222222"/>
-          <w:kern w:val="0"/>
-          <w:sz w:val="23"/>
-          <w:szCs w:val="23"/>
-          <w14:ligatures w14:val="none"/>
-        </w:rPr>
-        <w:t>)</w:t>
-      </w:r>
-      <w:r>
-        <w:rPr>
-          <w:rFonts w:ascii="Open Sans" w:eastAsia="Times New Roman" w:hAnsi="Open Sans" w:cs="Open Sans"/>
-          <w:color w:val="222222"/>
-          <w:kern w:val="0"/>
-          <w:sz w:val="23"/>
-          <w:szCs w:val="23"/>
-          <w14:ligatures w14:val="none"/>
-        </w:rPr>
-        <w:t xml:space="preserve"> because</w:t>
-      </w:r>
+        <w:t xml:space="preserve">O </w:t>
+      </w:r>
+      <w:proofErr w:type="gramStart"/>
+      <w:r>
+        <w:rPr>
+          <w:rFonts w:ascii="Open Sans" w:eastAsia="Times New Roman" w:hAnsi="Open Sans" w:cs="Open Sans"/>
+          <w:color w:val="222222"/>
+          <w:kern w:val="0"/>
+          <w:sz w:val="23"/>
+          <w:szCs w:val="23"/>
+          <w14:ligatures w14:val="none"/>
+        </w:rPr>
+        <w:t>( l</w:t>
+      </w:r>
+      <w:proofErr w:type="gramEnd"/>
+      <w:r>
+        <w:rPr>
+          <w:rFonts w:ascii="Open Sans" w:eastAsia="Times New Roman" w:hAnsi="Open Sans" w:cs="Open Sans"/>
+          <w:color w:val="222222"/>
+          <w:kern w:val="0"/>
+          <w:sz w:val="23"/>
+          <w:szCs w:val="23"/>
+          <w14:ligatures w14:val="none"/>
+        </w:rPr>
+        <w:t>*c +s*</w:t>
+      </w:r>
+      <w:proofErr w:type="gramStart"/>
+      <w:r>
+        <w:rPr>
+          <w:rFonts w:ascii="Open Sans" w:eastAsia="Times New Roman" w:hAnsi="Open Sans" w:cs="Open Sans"/>
+          <w:color w:val="222222"/>
+          <w:kern w:val="0"/>
+          <w:sz w:val="23"/>
+          <w:szCs w:val="23"/>
+          <w14:ligatures w14:val="none"/>
+        </w:rPr>
+        <w:t>l)</w:t>
+      </w:r>
+      <w:r>
+        <w:rPr>
+          <w:rFonts w:ascii="Open Sans" w:eastAsia="Times New Roman" w:hAnsi="Open Sans" w:cs="Open Sans"/>
+          <w:color w:val="222222"/>
+          <w:kern w:val="0"/>
+          <w:sz w:val="23"/>
+          <w:szCs w:val="23"/>
+          <w14:ligatures w14:val="none"/>
+        </w:rPr>
+        <w:t>because</w:t>
+      </w:r>
+      <w:proofErr w:type="gramEnd"/>
       <w:r>
         <w:rPr>
           <w:rFonts w:ascii="Open Sans" w:eastAsia="Times New Roman" w:hAnsi="Open Sans" w:cs="Open Sans"/>
@@ -1068,75 +1049,42 @@
           <w:szCs w:val="23"/>
           <w14:ligatures w14:val="none"/>
         </w:rPr>
-        <w:t xml:space="preserve"> + s)) = O(2n</w:t>
-      </w:r>
-      <w:r>
-        <w:rPr>
-          <w:rFonts w:ascii="Open Sans" w:eastAsia="Times New Roman" w:hAnsi="Open Sans" w:cs="Open Sans"/>
-          <w:color w:val="222222"/>
-          <w:kern w:val="0"/>
-          <w:sz w:val="23"/>
-          <w:szCs w:val="23"/>
-          <w:vertAlign w:val="superscript"/>
-          <w14:ligatures w14:val="none"/>
-        </w:rPr>
-        <w:t>2</w:t>
-      </w:r>
-      <w:r>
-        <w:rPr>
-          <w:rFonts w:ascii="Open Sans" w:eastAsia="Times New Roman" w:hAnsi="Open Sans" w:cs="Open Sans"/>
-          <w:color w:val="222222"/>
-          <w:kern w:val="0"/>
-          <w:sz w:val="23"/>
-          <w:szCs w:val="23"/>
-          <w14:ligatures w14:val="none"/>
-        </w:rPr>
-        <w:t xml:space="preserve">) = </w:t>
-      </w:r>
-      <w:r>
-        <w:rPr>
-          <w:rFonts w:ascii="Open Sans" w:eastAsia="Times New Roman" w:hAnsi="Open Sans" w:cs="Open Sans"/>
-          <w:color w:val="222222"/>
-          <w:kern w:val="0"/>
-          <w:sz w:val="23"/>
-          <w:szCs w:val="23"/>
-          <w14:ligatures w14:val="none"/>
-        </w:rPr>
-        <w:t>O(n</w:t>
-      </w:r>
-      <w:r>
-        <w:rPr>
-          <w:rFonts w:ascii="Open Sans" w:eastAsia="Times New Roman" w:hAnsi="Open Sans" w:cs="Open Sans"/>
-          <w:color w:val="222222"/>
-          <w:kern w:val="0"/>
-          <w:sz w:val="23"/>
-          <w:szCs w:val="23"/>
-          <w:vertAlign w:val="superscript"/>
-          <w14:ligatures w14:val="none"/>
-        </w:rPr>
-        <w:t>2</w:t>
-      </w:r>
-      <w:r>
-        <w:rPr>
-          <w:rFonts w:ascii="Open Sans" w:eastAsia="Times New Roman" w:hAnsi="Open Sans" w:cs="Open Sans"/>
-          <w:color w:val="222222"/>
-          <w:kern w:val="0"/>
-          <w:sz w:val="23"/>
-          <w:szCs w:val="23"/>
-          <w14:ligatures w14:val="none"/>
-        </w:rPr>
-        <w:t>)</w:t>
-      </w:r>
-      <w:r>
-        <w:rPr>
-          <w:rFonts w:ascii="Open Sans" w:eastAsia="Times New Roman" w:hAnsi="Open Sans" w:cs="Open Sans"/>
-          <w:color w:val="222222"/>
-          <w:kern w:val="0"/>
-          <w:sz w:val="23"/>
-          <w:szCs w:val="23"/>
-          <w14:ligatures w14:val="none"/>
-        </w:rPr>
-        <w:t xml:space="preserve"> </w:t>
+        <w:t xml:space="preserve"> + s)) = </w:t>
+      </w:r>
+      <w:r>
+        <w:rPr>
+          <w:rFonts w:ascii="Open Sans" w:eastAsia="Times New Roman" w:hAnsi="Open Sans" w:cs="Open Sans"/>
+          <w:color w:val="222222"/>
+          <w:kern w:val="0"/>
+          <w:sz w:val="23"/>
+          <w:szCs w:val="23"/>
+          <w14:ligatures w14:val="none"/>
+        </w:rPr>
+        <w:t xml:space="preserve">O </w:t>
+      </w:r>
+      <w:proofErr w:type="gramStart"/>
+      <w:r>
+        <w:rPr>
+          <w:rFonts w:ascii="Open Sans" w:eastAsia="Times New Roman" w:hAnsi="Open Sans" w:cs="Open Sans"/>
+          <w:color w:val="222222"/>
+          <w:kern w:val="0"/>
+          <w:sz w:val="23"/>
+          <w:szCs w:val="23"/>
+          <w14:ligatures w14:val="none"/>
+        </w:rPr>
+        <w:t>( l</w:t>
+      </w:r>
+      <w:proofErr w:type="gramEnd"/>
+      <w:r>
+        <w:rPr>
+          <w:rFonts w:ascii="Open Sans" w:eastAsia="Times New Roman" w:hAnsi="Open Sans" w:cs="Open Sans"/>
+          <w:color w:val="222222"/>
+          <w:kern w:val="0"/>
+          <w:sz w:val="23"/>
+          <w:szCs w:val="23"/>
+          <w14:ligatures w14:val="none"/>
+        </w:rPr>
+        <w:t>*c +s*l)</w:t>
       </w:r>
     </w:p>
     <w:p>
@@ -1361,18 +1309,7 @@
           <w:szCs w:val="23"/>
           <w14:ligatures w14:val="none"/>
         </w:rPr>
-        <w:t xml:space="preserve">the number of operations is </w:t>
-      </w:r>
-      <w:r>
-        <w:rPr>
-          <w:rFonts w:ascii="Open Sans" w:eastAsia="Times New Roman" w:hAnsi="Open Sans" w:cs="Open Sans"/>
-          <w:color w:val="222222"/>
-          <w:kern w:val="0"/>
-          <w:sz w:val="23"/>
-          <w:szCs w:val="23"/>
-          <w14:ligatures w14:val="none"/>
-        </w:rPr>
-        <w:t>log</w:t>
+        <w:t>the number of operations is log</w:t>
       </w:r>
       <w:r>
         <w:rPr>
@@ -1395,18 +1332,7 @@
           <w:szCs w:val="23"/>
           <w14:ligatures w14:val="none"/>
         </w:rPr>
-        <w:t xml:space="preserve"> n</w:t>
-      </w:r>
-      <w:r>
-        <w:rPr>
-          <w:rFonts w:ascii="Open Sans" w:eastAsia="Times New Roman" w:hAnsi="Open Sans" w:cs="Open Sans"/>
-          <w:color w:val="222222"/>
-          <w:kern w:val="0"/>
-          <w:sz w:val="23"/>
-          <w:szCs w:val="23"/>
-          <w14:ligatures w14:val="none"/>
-        </w:rPr>
-        <w:t>. The search space is divided by 2 during each iteration.</w:t>
+        <w:t xml:space="preserve"> n. The search space is divided by 2 during each iteration.</w:t>
       </w:r>
     </w:p>
     <w:p>
@@ -1540,40 +1466,7 @@
           <w:szCs w:val="23"/>
           <w14:ligatures w14:val="none"/>
         </w:rPr>
-        <w:t xml:space="preserve">the outer loop runs c times, and for every </w:t>
-      </w:r>
-      <w:r>
-        <w:rPr>
-          <w:rFonts w:ascii="Open Sans" w:eastAsia="Times New Roman" w:hAnsi="Open Sans" w:cs="Open Sans"/>
-          <w:color w:val="222222"/>
-          <w:kern w:val="0"/>
-          <w:sz w:val="23"/>
-          <w:szCs w:val="23"/>
-          <w14:ligatures w14:val="none"/>
-        </w:rPr>
-        <w:t>comment</w:t>
-      </w:r>
-      <w:r>
-        <w:rPr>
-          <w:rFonts w:ascii="Open Sans" w:eastAsia="Times New Roman" w:hAnsi="Open Sans" w:cs="Open Sans"/>
-          <w:color w:val="222222"/>
-          <w:kern w:val="0"/>
-          <w:sz w:val="23"/>
-          <w:szCs w:val="23"/>
-          <w14:ligatures w14:val="none"/>
-        </w:rPr>
-        <w:t xml:space="preserve"> would be executed by binary search and if user doesn’t like the post, </w:t>
-      </w:r>
-      <w:r>
-        <w:rPr>
-          <w:rFonts w:ascii="Open Sans" w:eastAsia="Times New Roman" w:hAnsi="Open Sans" w:cs="Open Sans"/>
-          <w:color w:val="222222"/>
-          <w:kern w:val="0"/>
-          <w:sz w:val="23"/>
-          <w:szCs w:val="23"/>
-          <w14:ligatures w14:val="none"/>
-        </w:rPr>
-        <w:t>it would be executed by linear search as well.</w:t>
+        <w:t>the outer loop runs c times, and for every comment would be executed by binary search and if user doesn’t like the post, it would be executed by linear search as well.</w:t>
       </w:r>
     </w:p>
     <w:p>
@@ -1623,40 +1516,7 @@
           <w:szCs w:val="23"/>
           <w14:ligatures w14:val="none"/>
         </w:rPr>
-        <w:t>O (n log n)</w:t>
-      </w:r>
-      <w:r>
-        <w:rPr>
-          <w:rFonts w:ascii="Open Sans" w:eastAsia="Times New Roman" w:hAnsi="Open Sans" w:cs="Open Sans"/>
-          <w:color w:val="222222"/>
-          <w:kern w:val="0"/>
-          <w:sz w:val="23"/>
-          <w:szCs w:val="23"/>
-          <w14:ligatures w14:val="none"/>
-        </w:rPr>
-        <w:t xml:space="preserve"> because </w:t>
-      </w:r>
-      <w:r>
-        <w:rPr>
-          <w:rFonts w:ascii="Open Sans" w:eastAsia="Times New Roman" w:hAnsi="Open Sans" w:cs="Open Sans"/>
-          <w:color w:val="222222"/>
-          <w:kern w:val="0"/>
-          <w:sz w:val="23"/>
-          <w:szCs w:val="23"/>
-          <w14:ligatures w14:val="none"/>
-        </w:rPr>
-        <w:t xml:space="preserve">when l, c and s are approaching infinite, then </w:t>
-      </w:r>
-      <w:r>
-        <w:rPr>
-          <w:rFonts w:ascii="Open Sans" w:eastAsia="Times New Roman" w:hAnsi="Open Sans" w:cs="Open Sans"/>
-          <w:color w:val="222222"/>
-          <w:kern w:val="0"/>
-          <w:sz w:val="23"/>
-          <w:szCs w:val="23"/>
-          <w14:ligatures w14:val="none"/>
-        </w:rPr>
-        <w:t>O (c</w:t>
+        <w:t xml:space="preserve">O (c * log l + c * </w:t>
       </w:r>
       <w:proofErr w:type="gramStart"/>
       <w:r>
@@ -1668,29 +1528,18 @@
           <w:szCs w:val="23"/>
           <w14:ligatures w14:val="none"/>
         </w:rPr>
-        <w:t xml:space="preserve">*( </w:t>
-      </w:r>
-      <w:r>
-        <w:rPr>
-          <w:rFonts w:ascii="Open Sans" w:eastAsia="Times New Roman" w:hAnsi="Open Sans" w:cs="Open Sans"/>
-          <w:color w:val="222222"/>
-          <w:kern w:val="0"/>
-          <w:sz w:val="23"/>
-          <w:szCs w:val="23"/>
-          <w14:ligatures w14:val="none"/>
-        </w:rPr>
-        <w:t>l</w:t>
-      </w:r>
-      <w:r>
-        <w:rPr>
-          <w:rFonts w:ascii="Open Sans" w:eastAsia="Times New Roman" w:hAnsi="Open Sans" w:cs="Open Sans"/>
-          <w:color w:val="222222"/>
-          <w:kern w:val="0"/>
-          <w:sz w:val="23"/>
-          <w:szCs w:val="23"/>
-          <w14:ligatures w14:val="none"/>
-        </w:rPr>
-        <w:t>og</w:t>
+        <w:t>s)</w:t>
+      </w:r>
+      <w:r>
+        <w:rPr>
+          <w:rFonts w:ascii="Open Sans" w:eastAsia="Times New Roman" w:hAnsi="Open Sans" w:cs="Open Sans"/>
+          <w:color w:val="222222"/>
+          <w:kern w:val="0"/>
+          <w:sz w:val="23"/>
+          <w:szCs w:val="23"/>
+          <w14:ligatures w14:val="none"/>
+        </w:rPr>
+        <w:t>because</w:t>
       </w:r>
       <w:proofErr w:type="gramEnd"/>
       <w:r>
@@ -1700,6 +1549,41 @@
           <w:kern w:val="0"/>
           <w:sz w:val="23"/>
           <w:szCs w:val="23"/>
+          <w14:ligatures w14:val="none"/>
+        </w:rPr>
+        <w:t xml:space="preserve"> </w:t>
+      </w:r>
+      <w:r>
+        <w:rPr>
+          <w:rFonts w:ascii="Open Sans" w:eastAsia="Times New Roman" w:hAnsi="Open Sans" w:cs="Open Sans"/>
+          <w:color w:val="222222"/>
+          <w:kern w:val="0"/>
+          <w:sz w:val="23"/>
+          <w:szCs w:val="23"/>
+          <w14:ligatures w14:val="none"/>
+        </w:rPr>
+        <w:t>when l, c and s are approaching infinite, then O (c</w:t>
+      </w:r>
+      <w:proofErr w:type="gramStart"/>
+      <w:r>
+        <w:rPr>
+          <w:rFonts w:ascii="Open Sans" w:eastAsia="Times New Roman" w:hAnsi="Open Sans" w:cs="Open Sans"/>
+          <w:color w:val="222222"/>
+          <w:kern w:val="0"/>
+          <w:sz w:val="23"/>
+          <w:szCs w:val="23"/>
+          <w14:ligatures w14:val="none"/>
+        </w:rPr>
+        <w:t>*( log</w:t>
+      </w:r>
+      <w:proofErr w:type="gramEnd"/>
+      <w:r>
+        <w:rPr>
+          <w:rFonts w:ascii="Open Sans" w:eastAsia="Times New Roman" w:hAnsi="Open Sans" w:cs="Open Sans"/>
+          <w:color w:val="222222"/>
+          <w:kern w:val="0"/>
+          <w:sz w:val="23"/>
+          <w:szCs w:val="23"/>
           <w:vertAlign w:val="subscript"/>
           <w14:ligatures w14:val="none"/>
         </w:rPr>
@@ -1714,7 +1598,29 @@
           <w:szCs w:val="23"/>
           <w14:ligatures w14:val="none"/>
         </w:rPr>
-        <w:t>l + s)) = O (n log n)</w:t>
+        <w:t>l + s)) = O (</w:t>
+      </w:r>
+      <w:r>
+        <w:rPr>
+          <w:rFonts w:ascii="Open Sans" w:eastAsia="Times New Roman" w:hAnsi="Open Sans" w:cs="Open Sans"/>
+          <w:color w:val="222222"/>
+          <w:kern w:val="0"/>
+          <w:sz w:val="23"/>
+          <w:szCs w:val="23"/>
+          <w14:ligatures w14:val="none"/>
+        </w:rPr>
+        <w:t>c * log l + c * s</w:t>
+      </w:r>
+      <w:r>
+        <w:rPr>
+          <w:rFonts w:ascii="Open Sans" w:eastAsia="Times New Roman" w:hAnsi="Open Sans" w:cs="Open Sans"/>
+          <w:color w:val="222222"/>
+          <w:kern w:val="0"/>
+          <w:sz w:val="23"/>
+          <w:szCs w:val="23"/>
+          <w14:ligatures w14:val="none"/>
+        </w:rPr>
+        <w:t>)</w:t>
       </w:r>
     </w:p>
     <w:p>
@@ -1884,18 +1790,42 @@
           <w:szCs w:val="23"/>
           <w14:ligatures w14:val="none"/>
         </w:rPr>
-        <w:t xml:space="preserve">O (n log </w:t>
-      </w:r>
-      <w:r>
-        <w:rPr>
-          <w:rFonts w:ascii="Open Sans" w:eastAsia="Times New Roman" w:hAnsi="Open Sans" w:cs="Open Sans"/>
-          <w:color w:val="222222"/>
-          <w:kern w:val="0"/>
-          <w:sz w:val="23"/>
-          <w:szCs w:val="23"/>
-          <w14:ligatures w14:val="none"/>
-        </w:rPr>
-        <w:t>n)</w:t>
+        <w:t xml:space="preserve">O </w:t>
+      </w:r>
+      <w:proofErr w:type="gramStart"/>
+      <w:r>
+        <w:rPr>
+          <w:rFonts w:ascii="Open Sans" w:eastAsia="Times New Roman" w:hAnsi="Open Sans" w:cs="Open Sans"/>
+          <w:color w:val="222222"/>
+          <w:kern w:val="0"/>
+          <w:sz w:val="23"/>
+          <w:szCs w:val="23"/>
+          <w14:ligatures w14:val="none"/>
+        </w:rPr>
+        <w:t>( s</w:t>
+      </w:r>
+      <w:proofErr w:type="gramEnd"/>
+      <w:r>
+        <w:rPr>
+          <w:rFonts w:ascii="Open Sans" w:eastAsia="Times New Roman" w:hAnsi="Open Sans" w:cs="Open Sans"/>
+          <w:color w:val="222222"/>
+          <w:kern w:val="0"/>
+          <w:sz w:val="23"/>
+          <w:szCs w:val="23"/>
+          <w14:ligatures w14:val="none"/>
+        </w:rPr>
+        <w:t xml:space="preserve"> * log l + s**2</w:t>
+      </w:r>
+      <w:r>
+        <w:rPr>
+          <w:rFonts w:ascii="Open Sans" w:eastAsia="Times New Roman" w:hAnsi="Open Sans" w:cs="Open Sans"/>
+          <w:color w:val="222222"/>
+          <w:kern w:val="0"/>
+          <w:sz w:val="23"/>
+          <w:szCs w:val="23"/>
+          <w14:ligatures w14:val="none"/>
+        </w:rPr>
+        <w:t>)</w:t>
       </w:r>
       <w:r>
         <w:rPr>
@@ -1928,18 +1858,7 @@
           <w:szCs w:val="23"/>
           <w14:ligatures w14:val="none"/>
         </w:rPr>
-        <w:t>when l, c and s are approaching infinite, then O (</w:t>
-      </w:r>
-      <w:r>
-        <w:rPr>
-          <w:rFonts w:ascii="Open Sans" w:eastAsia="Times New Roman" w:hAnsi="Open Sans" w:cs="Open Sans"/>
-          <w:color w:val="222222"/>
-          <w:kern w:val="0"/>
-          <w:sz w:val="23"/>
-          <w:szCs w:val="23"/>
-          <w14:ligatures w14:val="none"/>
-        </w:rPr>
-        <w:t>s*(log</w:t>
+        <w:t>when l, c and s are approaching infinite, then O (s*(log</w:t>
       </w:r>
       <w:r>
         <w:rPr>
@@ -1962,7 +1881,86 @@
           <w:szCs w:val="23"/>
           <w14:ligatures w14:val="none"/>
         </w:rPr>
-        <w:t>l + s)) = O (n log n)</w:t>
+        <w:t xml:space="preserve">l + </w:t>
+      </w:r>
+      <w:r>
+        <w:rPr>
+          <w:rFonts w:ascii="Open Sans" w:eastAsia="Times New Roman" w:hAnsi="Open Sans" w:cs="Open Sans"/>
+          <w:color w:val="222222"/>
+          <w:kern w:val="0"/>
+          <w:sz w:val="23"/>
+          <w:szCs w:val="23"/>
+          <w14:ligatures w14:val="none"/>
+        </w:rPr>
+        <w:t>c</w:t>
+      </w:r>
+      <w:r>
+        <w:rPr>
+          <w:rFonts w:ascii="Open Sans" w:eastAsia="Times New Roman" w:hAnsi="Open Sans" w:cs="Open Sans"/>
+          <w:color w:val="222222"/>
+          <w:kern w:val="0"/>
+          <w:sz w:val="23"/>
+          <w:szCs w:val="23"/>
+          <w14:ligatures w14:val="none"/>
+        </w:rPr>
+        <w:t xml:space="preserve">)) = O </w:t>
+      </w:r>
+      <w:proofErr w:type="gramStart"/>
+      <w:r>
+        <w:rPr>
+          <w:rFonts w:ascii="Open Sans" w:eastAsia="Times New Roman" w:hAnsi="Open Sans" w:cs="Open Sans"/>
+          <w:color w:val="222222"/>
+          <w:kern w:val="0"/>
+          <w:sz w:val="23"/>
+          <w:szCs w:val="23"/>
+          <w14:ligatures w14:val="none"/>
+        </w:rPr>
+        <w:t>(</w:t>
+      </w:r>
+      <w:r>
+        <w:rPr>
+          <w:rFonts w:ascii="Open Sans" w:eastAsia="Times New Roman" w:hAnsi="Open Sans" w:cs="Open Sans"/>
+          <w:color w:val="222222"/>
+          <w:kern w:val="0"/>
+          <w:sz w:val="23"/>
+          <w:szCs w:val="23"/>
+          <w14:ligatures w14:val="none"/>
+        </w:rPr>
+        <w:t xml:space="preserve"> s</w:t>
+      </w:r>
+      <w:proofErr w:type="gramEnd"/>
+      <w:r>
+        <w:rPr>
+          <w:rFonts w:ascii="Open Sans" w:eastAsia="Times New Roman" w:hAnsi="Open Sans" w:cs="Open Sans"/>
+          <w:color w:val="222222"/>
+          <w:kern w:val="0"/>
+          <w:sz w:val="23"/>
+          <w:szCs w:val="23"/>
+          <w14:ligatures w14:val="none"/>
+        </w:rPr>
+        <w:t xml:space="preserve"> * log l + s*</w:t>
+      </w:r>
+      <w:r>
+        <w:rPr>
+          <w:rFonts w:ascii="Open Sans" w:eastAsia="Times New Roman" w:hAnsi="Open Sans" w:cs="Open Sans"/>
+          <w:color w:val="222222"/>
+          <w:kern w:val="0"/>
+          <w:sz w:val="23"/>
+          <w:szCs w:val="23"/>
+          <w14:ligatures w14:val="none"/>
+        </w:rPr>
+        <w:t>c</w:t>
+      </w:r>
+      <w:r>
+        <w:rPr>
+          <w:rFonts w:ascii="Open Sans" w:eastAsia="Times New Roman" w:hAnsi="Open Sans" w:cs="Open Sans"/>
+          <w:color w:val="222222"/>
+          <w:kern w:val="0"/>
+          <w:sz w:val="23"/>
+          <w:szCs w:val="23"/>
+          <w14:ligatures w14:val="none"/>
+        </w:rPr>
+        <w:t>)</w:t>
       </w:r>
     </w:p>
     <w:p>
@@ -2091,8 +2089,304 @@
           <w:szCs w:val="23"/>
           <w14:ligatures w14:val="none"/>
         </w:rPr>
-        <w:t>(</w:t>
-      </w:r>
+        <w:t>(l-</w:t>
+      </w:r>
+      <w:r>
+        <w:rPr>
+          <w:rFonts w:ascii="Open Sans" w:eastAsia="Times New Roman" w:hAnsi="Open Sans" w:cs="Open Sans"/>
+          <w:color w:val="222222"/>
+          <w:kern w:val="0"/>
+          <w:sz w:val="23"/>
+          <w:szCs w:val="23"/>
+          <w14:ligatures w14:val="none"/>
+        </w:rPr>
+        <w:t>1) *</w:t>
+      </w:r>
+      <w:r>
+        <w:rPr>
+          <w:rFonts w:ascii="Open Sans" w:eastAsia="Times New Roman" w:hAnsi="Open Sans" w:cs="Open Sans"/>
+          <w:color w:val="222222"/>
+          <w:kern w:val="0"/>
+          <w:sz w:val="23"/>
+          <w:szCs w:val="23"/>
+          <w14:ligatures w14:val="none"/>
+        </w:rPr>
+        <w:t>l / 2 +</w:t>
+      </w:r>
+      <w:r>
+        <w:rPr>
+          <w:rFonts w:ascii="Open Sans" w:eastAsia="Times New Roman" w:hAnsi="Open Sans" w:cs="Open Sans"/>
+          <w:color w:val="222222"/>
+          <w:kern w:val="0"/>
+          <w:sz w:val="23"/>
+          <w:szCs w:val="23"/>
+          <w14:ligatures w14:val="none"/>
+        </w:rPr>
+        <w:t xml:space="preserve"> l*(c + s) + c*(log</w:t>
+      </w:r>
+      <w:r>
+        <w:rPr>
+          <w:rFonts w:ascii="Open Sans" w:eastAsia="Times New Roman" w:hAnsi="Open Sans" w:cs="Open Sans"/>
+          <w:color w:val="222222"/>
+          <w:kern w:val="0"/>
+          <w:sz w:val="23"/>
+          <w:szCs w:val="23"/>
+          <w:vertAlign w:val="subscript"/>
+          <w14:ligatures w14:val="none"/>
+        </w:rPr>
+        <w:t>2</w:t>
+      </w:r>
+      <w:r>
+        <w:rPr>
+          <w:rFonts w:ascii="Open Sans" w:eastAsia="Times New Roman" w:hAnsi="Open Sans" w:cs="Open Sans"/>
+          <w:color w:val="222222"/>
+          <w:kern w:val="0"/>
+          <w:sz w:val="23"/>
+          <w:szCs w:val="23"/>
+          <w14:ligatures w14:val="none"/>
+        </w:rPr>
+        <w:t>l + s) +</w:t>
+      </w:r>
+      <w:r>
+        <w:rPr>
+          <w:rFonts w:ascii="Open Sans" w:eastAsia="Times New Roman" w:hAnsi="Open Sans" w:cs="Open Sans"/>
+          <w:color w:val="222222"/>
+          <w:kern w:val="0"/>
+          <w:sz w:val="23"/>
+          <w:szCs w:val="23"/>
+          <w14:ligatures w14:val="none"/>
+        </w:rPr>
+        <w:t xml:space="preserve"> </w:t>
+      </w:r>
+      <w:r>
+        <w:rPr>
+          <w:rFonts w:ascii="Open Sans" w:eastAsia="Times New Roman" w:hAnsi="Open Sans" w:cs="Open Sans"/>
+          <w:color w:val="222222"/>
+          <w:kern w:val="0"/>
+          <w:sz w:val="23"/>
+          <w:szCs w:val="23"/>
+          <w14:ligatures w14:val="none"/>
+        </w:rPr>
+        <w:t>s*(log</w:t>
+      </w:r>
+      <w:r>
+        <w:rPr>
+          <w:rFonts w:ascii="Open Sans" w:eastAsia="Times New Roman" w:hAnsi="Open Sans" w:cs="Open Sans"/>
+          <w:color w:val="222222"/>
+          <w:kern w:val="0"/>
+          <w:sz w:val="23"/>
+          <w:szCs w:val="23"/>
+          <w:vertAlign w:val="subscript"/>
+          <w14:ligatures w14:val="none"/>
+        </w:rPr>
+        <w:t>2</w:t>
+      </w:r>
+      <w:r>
+        <w:rPr>
+          <w:rFonts w:ascii="Open Sans" w:eastAsia="Times New Roman" w:hAnsi="Open Sans" w:cs="Open Sans"/>
+          <w:color w:val="222222"/>
+          <w:kern w:val="0"/>
+          <w:sz w:val="23"/>
+          <w:szCs w:val="23"/>
+          <w14:ligatures w14:val="none"/>
+        </w:rPr>
+        <w:t>l+c)</w:t>
+      </w:r>
+      <w:r>
+        <w:rPr>
+          <w:rFonts w:ascii="Open Sans" w:eastAsia="Times New Roman" w:hAnsi="Open Sans" w:cs="Open Sans"/>
+          <w:color w:val="222222"/>
+          <w:kern w:val="0"/>
+          <w:sz w:val="23"/>
+          <w:szCs w:val="23"/>
+          <w14:ligatures w14:val="none"/>
+        </w:rPr>
+        <w:t xml:space="preserve"> </w:t>
+      </w:r>
+      <w:r>
+        <w:rPr>
+          <w:rFonts w:ascii="Open Sans" w:eastAsia="Times New Roman" w:hAnsi="Open Sans" w:cs="Open Sans"/>
+          <w:color w:val="222222"/>
+          <w:kern w:val="0"/>
+          <w:sz w:val="23"/>
+          <w:szCs w:val="23"/>
+          <w14:ligatures w14:val="none"/>
+        </w:rPr>
+        <w:t xml:space="preserve">because the function firstly calls </w:t>
+      </w:r>
+      <w:proofErr w:type="spellStart"/>
+      <w:r>
+        <w:rPr>
+          <w:rFonts w:ascii="Open Sans" w:eastAsia="Times New Roman" w:hAnsi="Open Sans" w:cs="Open Sans"/>
+          <w:color w:val="222222"/>
+          <w:kern w:val="0"/>
+          <w:sz w:val="23"/>
+          <w:szCs w:val="23"/>
+          <w14:ligatures w14:val="none"/>
+        </w:rPr>
+        <w:t>bubble_sort</w:t>
+      </w:r>
+      <w:proofErr w:type="spellEnd"/>
+      <w:r>
+        <w:rPr>
+          <w:rFonts w:ascii="Open Sans" w:eastAsia="Times New Roman" w:hAnsi="Open Sans" w:cs="Open Sans"/>
+          <w:color w:val="222222"/>
+          <w:kern w:val="0"/>
+          <w:sz w:val="23"/>
+          <w:szCs w:val="23"/>
+          <w14:ligatures w14:val="none"/>
+        </w:rPr>
+        <w:t xml:space="preserve">. It then calls </w:t>
+      </w:r>
+      <w:proofErr w:type="spellStart"/>
+      <w:r>
+        <w:rPr>
+          <w:rFonts w:ascii="Open Sans" w:eastAsia="Times New Roman" w:hAnsi="Open Sans" w:cs="Open Sans"/>
+          <w:color w:val="222222"/>
+          <w:kern w:val="0"/>
+          <w:sz w:val="23"/>
+          <w:szCs w:val="23"/>
+          <w14:ligatures w14:val="none"/>
+        </w:rPr>
+        <w:t>count_liked</w:t>
+      </w:r>
+      <w:proofErr w:type="spellEnd"/>
+      <w:r>
+        <w:rPr>
+          <w:rFonts w:ascii="Open Sans" w:eastAsia="Times New Roman" w:hAnsi="Open Sans" w:cs="Open Sans"/>
+          <w:color w:val="222222"/>
+          <w:kern w:val="0"/>
+          <w:sz w:val="23"/>
+          <w:szCs w:val="23"/>
+          <w14:ligatures w14:val="none"/>
+        </w:rPr>
+        <w:t xml:space="preserve">, </w:t>
+      </w:r>
+      <w:proofErr w:type="spellStart"/>
+      <w:r>
+        <w:rPr>
+          <w:rFonts w:ascii="Open Sans" w:eastAsia="Times New Roman" w:hAnsi="Open Sans" w:cs="Open Sans"/>
+          <w:color w:val="222222"/>
+          <w:kern w:val="0"/>
+          <w:sz w:val="23"/>
+          <w:szCs w:val="23"/>
+          <w14:ligatures w14:val="none"/>
+        </w:rPr>
+        <w:t>count_comment_no_liked</w:t>
+      </w:r>
+      <w:proofErr w:type="spellEnd"/>
+      <w:r>
+        <w:rPr>
+          <w:rFonts w:ascii="Open Sans" w:eastAsia="Times New Roman" w:hAnsi="Open Sans" w:cs="Open Sans"/>
+          <w:color w:val="222222"/>
+          <w:kern w:val="0"/>
+          <w:sz w:val="23"/>
+          <w:szCs w:val="23"/>
+          <w14:ligatures w14:val="none"/>
+        </w:rPr>
+        <w:t xml:space="preserve"> and </w:t>
+      </w:r>
+      <w:proofErr w:type="spellStart"/>
+      <w:r>
+        <w:rPr>
+          <w:rFonts w:ascii="Open Sans" w:eastAsia="Times New Roman" w:hAnsi="Open Sans" w:cs="Open Sans"/>
+          <w:color w:val="222222"/>
+          <w:kern w:val="0"/>
+          <w:sz w:val="23"/>
+          <w:szCs w:val="23"/>
+          <w14:ligatures w14:val="none"/>
+        </w:rPr>
+        <w:t>count_only_share</w:t>
+      </w:r>
+      <w:proofErr w:type="spellEnd"/>
+      <w:r>
+        <w:rPr>
+          <w:rFonts w:ascii="Open Sans" w:eastAsia="Times New Roman" w:hAnsi="Open Sans" w:cs="Open Sans"/>
+          <w:color w:val="222222"/>
+          <w:kern w:val="0"/>
+          <w:sz w:val="23"/>
+          <w:szCs w:val="23"/>
+          <w14:ligatures w14:val="none"/>
+        </w:rPr>
+        <w:t>.</w:t>
+      </w:r>
+    </w:p>
+    <w:p>
+      <w:pPr>
+        <w:shd w:val="clear" w:color="auto" w:fill="FFFFFF"/>
+        <w:spacing w:after="0" w:line="240" w:lineRule="auto"/>
+        <w:rPr>
+          <w:rFonts w:ascii="Open Sans" w:eastAsia="Times New Roman" w:hAnsi="Open Sans" w:cs="Open Sans"/>
+          <w:color w:val="222222"/>
+          <w:kern w:val="0"/>
+          <w:sz w:val="23"/>
+          <w:szCs w:val="23"/>
+          <w14:ligatures w14:val="none"/>
+        </w:rPr>
+      </w:pPr>
+    </w:p>
+    <w:p>
+      <w:pPr>
+        <w:shd w:val="clear" w:color="auto" w:fill="FFFFFF"/>
+        <w:spacing w:after="0" w:line="240" w:lineRule="auto"/>
+        <w:rPr>
+          <w:rFonts w:ascii="Open Sans" w:eastAsia="Times New Roman" w:hAnsi="Open Sans" w:cs="Open Sans"/>
+          <w:color w:val="222222"/>
+          <w:kern w:val="0"/>
+          <w:sz w:val="23"/>
+          <w:szCs w:val="23"/>
+          <w14:ligatures w14:val="none"/>
+        </w:rPr>
+      </w:pPr>
+      <w:r>
+        <w:rPr>
+          <w:rFonts w:ascii="Open Sans" w:eastAsia="Times New Roman" w:hAnsi="Open Sans" w:cs="Open Sans"/>
+          <w:color w:val="222222"/>
+          <w:kern w:val="0"/>
+          <w:sz w:val="23"/>
+          <w:szCs w:val="23"/>
+          <w14:ligatures w14:val="none"/>
+        </w:rPr>
+        <w:t>The Big-O complexity is</w:t>
+      </w:r>
+      <w:r>
+        <w:rPr>
+          <w:rFonts w:ascii="Open Sans" w:eastAsia="Times New Roman" w:hAnsi="Open Sans" w:cs="Open Sans"/>
+          <w:color w:val="222222"/>
+          <w:kern w:val="0"/>
+          <w:sz w:val="23"/>
+          <w:szCs w:val="23"/>
+          <w14:ligatures w14:val="none"/>
+        </w:rPr>
+        <w:t>:</w:t>
+      </w:r>
+    </w:p>
+    <w:p>
+      <w:pPr>
+        <w:shd w:val="clear" w:color="auto" w:fill="FFFFFF"/>
+        <w:spacing w:after="0" w:line="240" w:lineRule="auto"/>
+        <w:rPr>
+          <w:rFonts w:ascii="Open Sans" w:eastAsia="Times New Roman" w:hAnsi="Open Sans" w:cs="Open Sans"/>
+          <w:color w:val="222222"/>
+          <w:kern w:val="0"/>
+          <w:sz w:val="23"/>
+          <w:szCs w:val="23"/>
+          <w14:ligatures w14:val="none"/>
+        </w:rPr>
+      </w:pPr>
+      <w:proofErr w:type="gramStart"/>
+      <w:r>
+        <w:rPr>
+          <w:rFonts w:ascii="Open Sans" w:eastAsia="Times New Roman" w:hAnsi="Open Sans" w:cs="Open Sans"/>
+          <w:color w:val="222222"/>
+          <w:kern w:val="0"/>
+          <w:sz w:val="23"/>
+          <w:szCs w:val="23"/>
+          <w14:ligatures w14:val="none"/>
+        </w:rPr>
+        <w:t>O(</w:t>
+      </w:r>
+      <w:proofErr w:type="gramEnd"/>
       <w:r>
         <w:rPr>
           <w:rFonts w:ascii="Open Sans" w:eastAsia="Times New Roman" w:hAnsi="Open Sans" w:cs="Open Sans"/>
@@ -2111,20 +2405,93 @@
           <w:kern w:val="0"/>
           <w:sz w:val="23"/>
           <w:szCs w:val="23"/>
-          <w14:ligatures w14:val="none"/>
-        </w:rPr>
-        <w:t>-</w:t>
-      </w:r>
-      <w:r>
-        <w:rPr>
-          <w:rFonts w:ascii="Open Sans" w:eastAsia="Times New Roman" w:hAnsi="Open Sans" w:cs="Open Sans"/>
-          <w:color w:val="222222"/>
-          <w:kern w:val="0"/>
-          <w:sz w:val="23"/>
-          <w:szCs w:val="23"/>
-          <w14:ligatures w14:val="none"/>
-        </w:rPr>
-        <w:t>1) *</w:t>
+          <w:vertAlign w:val="superscript"/>
+          <w14:ligatures w14:val="none"/>
+        </w:rPr>
+        <w:t>2</w:t>
+      </w:r>
+      <w:r>
+        <w:rPr>
+          <w:rFonts w:ascii="Open Sans" w:eastAsia="Times New Roman" w:hAnsi="Open Sans" w:cs="Open Sans"/>
+          <w:color w:val="222222"/>
+          <w:kern w:val="0"/>
+          <w:sz w:val="23"/>
+          <w:szCs w:val="23"/>
+          <w14:ligatures w14:val="none"/>
+        </w:rPr>
+        <w:t xml:space="preserve"> / 2 – l / 2 + l*c + l*s + c*</w:t>
+      </w:r>
+      <w:proofErr w:type="spellStart"/>
+      <w:r>
+        <w:rPr>
+          <w:rFonts w:ascii="Open Sans" w:eastAsia="Times New Roman" w:hAnsi="Open Sans" w:cs="Open Sans"/>
+          <w:color w:val="222222"/>
+          <w:kern w:val="0"/>
+          <w:sz w:val="23"/>
+          <w:szCs w:val="23"/>
+          <w14:ligatures w14:val="none"/>
+        </w:rPr>
+        <w:t>logl</w:t>
+      </w:r>
+      <w:proofErr w:type="spellEnd"/>
+      <w:r>
+        <w:rPr>
+          <w:rFonts w:ascii="Open Sans" w:eastAsia="Times New Roman" w:hAnsi="Open Sans" w:cs="Open Sans"/>
+          <w:color w:val="222222"/>
+          <w:kern w:val="0"/>
+          <w:sz w:val="23"/>
+          <w:szCs w:val="23"/>
+          <w14:ligatures w14:val="none"/>
+        </w:rPr>
+        <w:t xml:space="preserve"> + 2*c*s + s*log l</w:t>
+      </w:r>
+      <w:r>
+        <w:rPr>
+          <w:rFonts w:ascii="Open Sans" w:eastAsia="Times New Roman" w:hAnsi="Open Sans" w:cs="Open Sans"/>
+          <w:color w:val="222222"/>
+          <w:kern w:val="0"/>
+          <w:sz w:val="23"/>
+          <w:szCs w:val="23"/>
+          <w14:ligatures w14:val="none"/>
+        </w:rPr>
+        <w:t xml:space="preserve">) </w:t>
+      </w:r>
+    </w:p>
+    <w:p>
+      <w:pPr>
+        <w:shd w:val="clear" w:color="auto" w:fill="FFFFFF"/>
+        <w:spacing w:after="0" w:line="240" w:lineRule="auto"/>
+        <w:rPr>
+          <w:rFonts w:ascii="Open Sans" w:eastAsia="Times New Roman" w:hAnsi="Open Sans" w:cs="Open Sans"/>
+          <w:color w:val="222222"/>
+          <w:kern w:val="0"/>
+          <w:sz w:val="23"/>
+          <w:szCs w:val="23"/>
+          <w14:ligatures w14:val="none"/>
+        </w:rPr>
+      </w:pPr>
+      <w:r>
+        <w:rPr>
+          <w:rFonts w:ascii="Open Sans" w:eastAsia="Times New Roman" w:hAnsi="Open Sans" w:cs="Open Sans"/>
+          <w:color w:val="222222"/>
+          <w:kern w:val="0"/>
+          <w:sz w:val="23"/>
+          <w:szCs w:val="23"/>
+          <w14:ligatures w14:val="none"/>
+        </w:rPr>
+        <w:t xml:space="preserve">= </w:t>
+      </w:r>
+      <w:proofErr w:type="gramStart"/>
+      <w:r>
+        <w:rPr>
+          <w:rFonts w:ascii="Open Sans" w:eastAsia="Times New Roman" w:hAnsi="Open Sans" w:cs="Open Sans"/>
+          <w:color w:val="222222"/>
+          <w:kern w:val="0"/>
+          <w:sz w:val="23"/>
+          <w:szCs w:val="23"/>
+          <w14:ligatures w14:val="none"/>
+        </w:rPr>
+        <w:t xml:space="preserve">O( </w:t>
       </w:r>
       <w:r>
         <w:rPr>
@@ -2137,6 +2504,19 @@
         </w:rPr>
         <w:t>l</w:t>
       </w:r>
+      <w:proofErr w:type="gramEnd"/>
+      <w:r>
+        <w:rPr>
+          <w:rFonts w:ascii="Open Sans" w:eastAsia="Times New Roman" w:hAnsi="Open Sans" w:cs="Open Sans"/>
+          <w:color w:val="222222"/>
+          <w:kern w:val="0"/>
+          <w:sz w:val="23"/>
+          <w:szCs w:val="23"/>
+          <w:vertAlign w:val="superscript"/>
+          <w14:ligatures w14:val="none"/>
+        </w:rPr>
+        <w:t>2</w:t>
+      </w:r>
       <w:r>
         <w:rPr>
           <w:rFonts w:ascii="Open Sans" w:eastAsia="Times New Roman" w:hAnsi="Open Sans" w:cs="Open Sans"/>
@@ -2157,15 +2537,138 @@
           <w:szCs w:val="23"/>
           <w14:ligatures w14:val="none"/>
         </w:rPr>
-        <w:t xml:space="preserve"> +</w:t>
-      </w:r>
-      <w:r>
-        <w:rPr>
-          <w:rFonts w:ascii="Open Sans" w:eastAsia="Times New Roman" w:hAnsi="Open Sans" w:cs="Open Sans"/>
-          <w:color w:val="222222"/>
-          <w:kern w:val="0"/>
-          <w:sz w:val="23"/>
-          <w:szCs w:val="23"/>
+        <w:t xml:space="preserve"> – l /2 + l * (</w:t>
+      </w:r>
+      <w:proofErr w:type="spellStart"/>
+      <w:r>
+        <w:rPr>
+          <w:rFonts w:ascii="Open Sans" w:eastAsia="Times New Roman" w:hAnsi="Open Sans" w:cs="Open Sans"/>
+          <w:color w:val="222222"/>
+          <w:kern w:val="0"/>
+          <w:sz w:val="23"/>
+          <w:szCs w:val="23"/>
+          <w14:ligatures w14:val="none"/>
+        </w:rPr>
+        <w:t>c+s</w:t>
+      </w:r>
+      <w:proofErr w:type="spellEnd"/>
+      <w:r>
+        <w:rPr>
+          <w:rFonts w:ascii="Open Sans" w:eastAsia="Times New Roman" w:hAnsi="Open Sans" w:cs="Open Sans"/>
+          <w:color w:val="222222"/>
+          <w:kern w:val="0"/>
+          <w:sz w:val="23"/>
+          <w:szCs w:val="23"/>
+          <w14:ligatures w14:val="none"/>
+        </w:rPr>
+        <w:t>) + (</w:t>
+      </w:r>
+      <w:proofErr w:type="spellStart"/>
+      <w:r>
+        <w:rPr>
+          <w:rFonts w:ascii="Open Sans" w:eastAsia="Times New Roman" w:hAnsi="Open Sans" w:cs="Open Sans"/>
+          <w:color w:val="222222"/>
+          <w:kern w:val="0"/>
+          <w:sz w:val="23"/>
+          <w:szCs w:val="23"/>
+          <w14:ligatures w14:val="none"/>
+        </w:rPr>
+        <w:t>c+</w:t>
+      </w:r>
+      <w:proofErr w:type="gramStart"/>
+      <w:r>
+        <w:rPr>
+          <w:rFonts w:ascii="Open Sans" w:eastAsia="Times New Roman" w:hAnsi="Open Sans" w:cs="Open Sans"/>
+          <w:color w:val="222222"/>
+          <w:kern w:val="0"/>
+          <w:sz w:val="23"/>
+          <w:szCs w:val="23"/>
+          <w14:ligatures w14:val="none"/>
+        </w:rPr>
+        <w:t>s</w:t>
+      </w:r>
+      <w:proofErr w:type="spellEnd"/>
+      <w:r>
+        <w:rPr>
+          <w:rFonts w:ascii="Open Sans" w:eastAsia="Times New Roman" w:hAnsi="Open Sans" w:cs="Open Sans"/>
+          <w:color w:val="222222"/>
+          <w:kern w:val="0"/>
+          <w:sz w:val="23"/>
+          <w:szCs w:val="23"/>
+          <w14:ligatures w14:val="none"/>
+        </w:rPr>
+        <w:t>)*</w:t>
+      </w:r>
+      <w:proofErr w:type="gramEnd"/>
+      <w:r>
+        <w:rPr>
+          <w:rFonts w:ascii="Open Sans" w:eastAsia="Times New Roman" w:hAnsi="Open Sans" w:cs="Open Sans"/>
+          <w:color w:val="222222"/>
+          <w:kern w:val="0"/>
+          <w:sz w:val="23"/>
+          <w:szCs w:val="23"/>
+          <w14:ligatures w14:val="none"/>
+        </w:rPr>
+        <w:t>log l + 2*c*</w:t>
+      </w:r>
+      <w:proofErr w:type="gramStart"/>
+      <w:r>
+        <w:rPr>
+          <w:rFonts w:ascii="Open Sans" w:eastAsia="Times New Roman" w:hAnsi="Open Sans" w:cs="Open Sans"/>
+          <w:color w:val="222222"/>
+          <w:kern w:val="0"/>
+          <w:sz w:val="23"/>
+          <w:szCs w:val="23"/>
+          <w14:ligatures w14:val="none"/>
+        </w:rPr>
+        <w:t>s )</w:t>
+      </w:r>
+      <w:proofErr w:type="gramEnd"/>
+    </w:p>
+    <w:p>
+      <w:pPr>
+        <w:shd w:val="clear" w:color="auto" w:fill="FFFFFF"/>
+        <w:spacing w:after="0" w:line="240" w:lineRule="auto"/>
+        <w:rPr>
+          <w:rFonts w:ascii="Open Sans" w:eastAsia="Times New Roman" w:hAnsi="Open Sans" w:cs="Open Sans"/>
+          <w:color w:val="222222"/>
+          <w:kern w:val="0"/>
+          <w:sz w:val="23"/>
+          <w:szCs w:val="23"/>
+          <w14:ligatures w14:val="none"/>
+        </w:rPr>
+      </w:pPr>
+      <w:r>
+        <w:rPr>
+          <w:rFonts w:ascii="Open Sans" w:eastAsia="Times New Roman" w:hAnsi="Open Sans" w:cs="Open Sans"/>
+          <w:color w:val="222222"/>
+          <w:kern w:val="0"/>
+          <w:sz w:val="23"/>
+          <w:szCs w:val="23"/>
+          <w14:ligatures w14:val="none"/>
+        </w:rPr>
+        <w:t>= O (l</w:t>
+      </w:r>
+      <w:r>
+        <w:rPr>
+          <w:rFonts w:ascii="Open Sans" w:eastAsia="Times New Roman" w:hAnsi="Open Sans" w:cs="Open Sans"/>
+          <w:color w:val="222222"/>
+          <w:kern w:val="0"/>
+          <w:sz w:val="23"/>
+          <w:szCs w:val="23"/>
+          <w:vertAlign w:val="superscript"/>
+          <w14:ligatures w14:val="none"/>
+        </w:rPr>
+        <w:t>2</w:t>
+      </w:r>
+      <w:r>
+        <w:rPr>
+          <w:rFonts w:ascii="Open Sans" w:eastAsia="Times New Roman" w:hAnsi="Open Sans" w:cs="Open Sans"/>
+          <w:color w:val="222222"/>
+          <w:kern w:val="0"/>
+          <w:sz w:val="23"/>
+          <w:szCs w:val="23"/>
+          <w:vertAlign w:val="superscript"/>
           <w14:ligatures w14:val="none"/>
         </w:rPr>
         <w:t xml:space="preserve"> </w:t>
@@ -2179,38 +2682,138 @@
           <w:szCs w:val="23"/>
           <w14:ligatures w14:val="none"/>
         </w:rPr>
-        <w:t xml:space="preserve">l*(c + s) </w:t>
-      </w:r>
-      <w:r>
-        <w:rPr>
-          <w:rFonts w:ascii="Open Sans" w:eastAsia="Times New Roman" w:hAnsi="Open Sans" w:cs="Open Sans"/>
-          <w:color w:val="222222"/>
-          <w:kern w:val="0"/>
-          <w:sz w:val="23"/>
-          <w:szCs w:val="23"/>
-          <w14:ligatures w14:val="none"/>
-        </w:rPr>
-        <w:t xml:space="preserve">+ </w:t>
-      </w:r>
-      <w:r>
-        <w:rPr>
-          <w:rFonts w:ascii="Open Sans" w:eastAsia="Times New Roman" w:hAnsi="Open Sans" w:cs="Open Sans"/>
-          <w:color w:val="222222"/>
-          <w:kern w:val="0"/>
-          <w:sz w:val="23"/>
-          <w:szCs w:val="23"/>
-          <w14:ligatures w14:val="none"/>
-        </w:rPr>
-        <w:t>c*(log</w:t>
-      </w:r>
-      <w:r>
-        <w:rPr>
-          <w:rFonts w:ascii="Open Sans" w:eastAsia="Times New Roman" w:hAnsi="Open Sans" w:cs="Open Sans"/>
-          <w:color w:val="222222"/>
-          <w:kern w:val="0"/>
-          <w:sz w:val="23"/>
-          <w:szCs w:val="23"/>
-          <w:vertAlign w:val="subscript"/>
+        <w:t>/</w:t>
+      </w:r>
+      <w:proofErr w:type="gramStart"/>
+      <w:r>
+        <w:rPr>
+          <w:rFonts w:ascii="Open Sans" w:eastAsia="Times New Roman" w:hAnsi="Open Sans" w:cs="Open Sans"/>
+          <w:color w:val="222222"/>
+          <w:kern w:val="0"/>
+          <w:sz w:val="23"/>
+          <w:szCs w:val="23"/>
+          <w14:ligatures w14:val="none"/>
+        </w:rPr>
+        <w:t>2  +</w:t>
+      </w:r>
+      <w:proofErr w:type="gramEnd"/>
+      <w:r>
+        <w:rPr>
+          <w:rFonts w:ascii="Open Sans" w:eastAsia="Times New Roman" w:hAnsi="Open Sans" w:cs="Open Sans"/>
+          <w:color w:val="222222"/>
+          <w:kern w:val="0"/>
+          <w:sz w:val="23"/>
+          <w:szCs w:val="23"/>
+          <w14:ligatures w14:val="none"/>
+        </w:rPr>
+        <w:t xml:space="preserve"> l * (c +s – </w:t>
+      </w:r>
+      <w:proofErr w:type="gramStart"/>
+      <w:r>
+        <w:rPr>
+          <w:rFonts w:ascii="Open Sans" w:eastAsia="Times New Roman" w:hAnsi="Open Sans" w:cs="Open Sans"/>
+          <w:color w:val="222222"/>
+          <w:kern w:val="0"/>
+          <w:sz w:val="23"/>
+          <w:szCs w:val="23"/>
+          <w14:ligatures w14:val="none"/>
+        </w:rPr>
+        <w:t>½ )</w:t>
+      </w:r>
+      <w:proofErr w:type="gramEnd"/>
+      <w:r>
+        <w:rPr>
+          <w:rFonts w:ascii="Open Sans" w:eastAsia="Times New Roman" w:hAnsi="Open Sans" w:cs="Open Sans"/>
+          <w:color w:val="222222"/>
+          <w:kern w:val="0"/>
+          <w:sz w:val="23"/>
+          <w:szCs w:val="23"/>
+          <w14:ligatures w14:val="none"/>
+        </w:rPr>
+        <w:t xml:space="preserve"> + (</w:t>
+      </w:r>
+      <w:proofErr w:type="spellStart"/>
+      <w:r>
+        <w:rPr>
+          <w:rFonts w:ascii="Open Sans" w:eastAsia="Times New Roman" w:hAnsi="Open Sans" w:cs="Open Sans"/>
+          <w:color w:val="222222"/>
+          <w:kern w:val="0"/>
+          <w:sz w:val="23"/>
+          <w:szCs w:val="23"/>
+          <w14:ligatures w14:val="none"/>
+        </w:rPr>
+        <w:t>c+</w:t>
+      </w:r>
+      <w:proofErr w:type="gramStart"/>
+      <w:r>
+        <w:rPr>
+          <w:rFonts w:ascii="Open Sans" w:eastAsia="Times New Roman" w:hAnsi="Open Sans" w:cs="Open Sans"/>
+          <w:color w:val="222222"/>
+          <w:kern w:val="0"/>
+          <w:sz w:val="23"/>
+          <w:szCs w:val="23"/>
+          <w14:ligatures w14:val="none"/>
+        </w:rPr>
+        <w:t>s</w:t>
+      </w:r>
+      <w:proofErr w:type="spellEnd"/>
+      <w:r>
+        <w:rPr>
+          <w:rFonts w:ascii="Open Sans" w:eastAsia="Times New Roman" w:hAnsi="Open Sans" w:cs="Open Sans"/>
+          <w:color w:val="222222"/>
+          <w:kern w:val="0"/>
+          <w:sz w:val="23"/>
+          <w:szCs w:val="23"/>
+          <w14:ligatures w14:val="none"/>
+        </w:rPr>
+        <w:t>)*</w:t>
+      </w:r>
+      <w:proofErr w:type="gramEnd"/>
+      <w:r>
+        <w:rPr>
+          <w:rFonts w:ascii="Open Sans" w:eastAsia="Times New Roman" w:hAnsi="Open Sans" w:cs="Open Sans"/>
+          <w:color w:val="222222"/>
+          <w:kern w:val="0"/>
+          <w:sz w:val="23"/>
+          <w:szCs w:val="23"/>
+          <w14:ligatures w14:val="none"/>
+        </w:rPr>
+        <w:t>log l +2 *c *s)</w:t>
+      </w:r>
+    </w:p>
+    <w:p>
+      <w:pPr>
+        <w:shd w:val="clear" w:color="auto" w:fill="FFFFFF"/>
+        <w:spacing w:after="0" w:line="240" w:lineRule="auto"/>
+        <w:rPr>
+          <w:rFonts w:ascii="Open Sans" w:eastAsia="Times New Roman" w:hAnsi="Open Sans" w:cs="Open Sans"/>
+          <w:color w:val="222222"/>
+          <w:kern w:val="0"/>
+          <w:sz w:val="23"/>
+          <w:szCs w:val="23"/>
+          <w:vertAlign w:val="superscript"/>
+          <w14:ligatures w14:val="none"/>
+        </w:rPr>
+      </w:pPr>
+      <w:r>
+        <w:rPr>
+          <w:rFonts w:ascii="Open Sans" w:eastAsia="Times New Roman" w:hAnsi="Open Sans" w:cs="Open Sans"/>
+          <w:color w:val="222222"/>
+          <w:kern w:val="0"/>
+          <w:sz w:val="23"/>
+          <w:szCs w:val="23"/>
+          <w14:ligatures w14:val="none"/>
+        </w:rPr>
+        <w:t>= O (l</w:t>
+      </w:r>
+      <w:r>
+        <w:rPr>
+          <w:rFonts w:ascii="Open Sans" w:eastAsia="Times New Roman" w:hAnsi="Open Sans" w:cs="Open Sans"/>
+          <w:color w:val="222222"/>
+          <w:kern w:val="0"/>
+          <w:sz w:val="23"/>
+          <w:szCs w:val="23"/>
+          <w:vertAlign w:val="superscript"/>
           <w14:ligatures w14:val="none"/>
         </w:rPr>
         <w:t>2</w:t>
@@ -2224,49 +2827,89 @@
           <w:szCs w:val="23"/>
           <w14:ligatures w14:val="none"/>
         </w:rPr>
-        <w:t>l + s)</w:t>
-      </w:r>
-      <w:r>
-        <w:rPr>
-          <w:rFonts w:ascii="Open Sans" w:eastAsia="Times New Roman" w:hAnsi="Open Sans" w:cs="Open Sans"/>
-          <w:color w:val="222222"/>
-          <w:kern w:val="0"/>
-          <w:sz w:val="23"/>
-          <w:szCs w:val="23"/>
-          <w14:ligatures w14:val="none"/>
-        </w:rPr>
-        <w:t xml:space="preserve"> +</w:t>
-      </w:r>
-      <w:r>
-        <w:rPr>
-          <w:rFonts w:ascii="Open Sans" w:eastAsia="Times New Roman" w:hAnsi="Open Sans" w:cs="Open Sans"/>
-          <w:color w:val="222222"/>
-          <w:kern w:val="0"/>
-          <w:sz w:val="23"/>
-          <w:szCs w:val="23"/>
+        <w:t xml:space="preserve">+ l * (c +s) + (c + </w:t>
+      </w:r>
+      <w:proofErr w:type="gramStart"/>
+      <w:r>
+        <w:rPr>
+          <w:rFonts w:ascii="Open Sans" w:eastAsia="Times New Roman" w:hAnsi="Open Sans" w:cs="Open Sans"/>
+          <w:color w:val="222222"/>
+          <w:kern w:val="0"/>
+          <w:sz w:val="23"/>
+          <w:szCs w:val="23"/>
+          <w14:ligatures w14:val="none"/>
+        </w:rPr>
+        <w:t>s)*</w:t>
+      </w:r>
+      <w:proofErr w:type="gramEnd"/>
+      <w:r>
+        <w:rPr>
+          <w:rFonts w:ascii="Open Sans" w:eastAsia="Times New Roman" w:hAnsi="Open Sans" w:cs="Open Sans"/>
+          <w:color w:val="222222"/>
+          <w:kern w:val="0"/>
+          <w:sz w:val="23"/>
+          <w:szCs w:val="23"/>
+          <w14:ligatures w14:val="none"/>
+        </w:rPr>
+        <w:t xml:space="preserve">log l + c*s) </w:t>
+      </w:r>
+      <w:r>
+        <w:rPr>
+          <w:rFonts w:ascii="Open Sans" w:eastAsia="Times New Roman" w:hAnsi="Open Sans" w:cs="Open Sans"/>
+          <w:color w:val="222222"/>
+          <w:kern w:val="0"/>
+          <w:sz w:val="23"/>
+          <w:szCs w:val="23"/>
+          <w:vertAlign w:val="superscript"/>
           <w14:ligatures w14:val="none"/>
         </w:rPr>
         <w:t xml:space="preserve"> </w:t>
       </w:r>
-      <w:r>
-        <w:rPr>
-          <w:rFonts w:ascii="Open Sans" w:eastAsia="Times New Roman" w:hAnsi="Open Sans" w:cs="Open Sans"/>
-          <w:color w:val="222222"/>
-          <w:kern w:val="0"/>
-          <w:sz w:val="23"/>
-          <w:szCs w:val="23"/>
-          <w14:ligatures w14:val="none"/>
-        </w:rPr>
-        <w:t>s*(log</w:t>
-      </w:r>
-      <w:r>
-        <w:rPr>
-          <w:rFonts w:ascii="Open Sans" w:eastAsia="Times New Roman" w:hAnsi="Open Sans" w:cs="Open Sans"/>
-          <w:color w:val="222222"/>
-          <w:kern w:val="0"/>
-          <w:sz w:val="23"/>
-          <w:szCs w:val="23"/>
-          <w:vertAlign w:val="subscript"/>
+    </w:p>
+    <w:p>
+      <w:pPr>
+        <w:shd w:val="clear" w:color="auto" w:fill="FFFFFF"/>
+        <w:spacing w:after="0" w:line="240" w:lineRule="auto"/>
+        <w:rPr>
+          <w:rFonts w:ascii="Open Sans" w:eastAsia="Times New Roman" w:hAnsi="Open Sans" w:cs="Open Sans"/>
+          <w:color w:val="222222"/>
+          <w:kern w:val="0"/>
+          <w:sz w:val="23"/>
+          <w:szCs w:val="23"/>
+          <w14:ligatures w14:val="none"/>
+        </w:rPr>
+      </w:pPr>
+      <w:r>
+        <w:rPr>
+          <w:rFonts w:ascii="Open Sans" w:eastAsia="Times New Roman" w:hAnsi="Open Sans" w:cs="Open Sans"/>
+          <w:color w:val="222222"/>
+          <w:kern w:val="0"/>
+          <w:sz w:val="23"/>
+          <w:szCs w:val="23"/>
+          <w:vertAlign w:val="superscript"/>
+          <w14:ligatures w14:val="none"/>
+        </w:rPr>
+        <w:t xml:space="preserve"> </w:t>
+      </w:r>
+      <w:r>
+        <w:rPr>
+          <w:rFonts w:ascii="Open Sans" w:eastAsia="Times New Roman" w:hAnsi="Open Sans" w:cs="Open Sans"/>
+          <w:color w:val="222222"/>
+          <w:kern w:val="0"/>
+          <w:sz w:val="23"/>
+          <w:szCs w:val="23"/>
+          <w14:ligatures w14:val="none"/>
+        </w:rPr>
+        <w:t>= O (l</w:t>
+      </w:r>
+      <w:r>
+        <w:rPr>
+          <w:rFonts w:ascii="Open Sans" w:eastAsia="Times New Roman" w:hAnsi="Open Sans" w:cs="Open Sans"/>
+          <w:color w:val="222222"/>
+          <w:kern w:val="0"/>
+          <w:sz w:val="23"/>
+          <w:szCs w:val="23"/>
+          <w:vertAlign w:val="superscript"/>
           <w14:ligatures w14:val="none"/>
         </w:rPr>
         <w:t>2</w:t>
@@ -2280,18 +2923,18 @@
           <w:szCs w:val="23"/>
           <w14:ligatures w14:val="none"/>
         </w:rPr>
-        <w:t>l+c</w:t>
-      </w:r>
-      <w:r>
-        <w:rPr>
-          <w:rFonts w:ascii="Open Sans" w:eastAsia="Times New Roman" w:hAnsi="Open Sans" w:cs="Open Sans"/>
-          <w:color w:val="222222"/>
-          <w:kern w:val="0"/>
-          <w:sz w:val="23"/>
-          <w:szCs w:val="23"/>
-          <w14:ligatures w14:val="none"/>
-        </w:rPr>
-        <w:t>)</w:t>
+        <w:t xml:space="preserve"> + c*l </w:t>
+      </w:r>
+      <w:r>
+        <w:rPr>
+          <w:rFonts w:ascii="Open Sans" w:eastAsia="Times New Roman" w:hAnsi="Open Sans" w:cs="Open Sans"/>
+          <w:color w:val="222222"/>
+          <w:kern w:val="0"/>
+          <w:sz w:val="23"/>
+          <w:szCs w:val="23"/>
+          <w14:ligatures w14:val="none"/>
+        </w:rPr>
+        <w:t>+</w:t>
       </w:r>
       <w:r>
         <w:rPr>
@@ -2313,155 +2956,37 @@
           <w:szCs w:val="23"/>
           <w14:ligatures w14:val="none"/>
         </w:rPr>
-        <w:t xml:space="preserve">because the function firstly calls </w:t>
-      </w:r>
-      <w:proofErr w:type="spellStart"/>
-      <w:r>
-        <w:rPr>
-          <w:rFonts w:ascii="Open Sans" w:eastAsia="Times New Roman" w:hAnsi="Open Sans" w:cs="Open Sans"/>
-          <w:color w:val="222222"/>
-          <w:kern w:val="0"/>
-          <w:sz w:val="23"/>
-          <w:szCs w:val="23"/>
-          <w14:ligatures w14:val="none"/>
-        </w:rPr>
-        <w:t>bubble_sort</w:t>
-      </w:r>
-      <w:proofErr w:type="spellEnd"/>
-      <w:r>
-        <w:rPr>
-          <w:rFonts w:ascii="Open Sans" w:eastAsia="Times New Roman" w:hAnsi="Open Sans" w:cs="Open Sans"/>
-          <w:color w:val="222222"/>
-          <w:kern w:val="0"/>
-          <w:sz w:val="23"/>
-          <w:szCs w:val="23"/>
-          <w14:ligatures w14:val="none"/>
-        </w:rPr>
-        <w:t xml:space="preserve">. It then calls </w:t>
-      </w:r>
-      <w:proofErr w:type="spellStart"/>
-      <w:r>
-        <w:rPr>
-          <w:rFonts w:ascii="Open Sans" w:eastAsia="Times New Roman" w:hAnsi="Open Sans" w:cs="Open Sans"/>
-          <w:color w:val="222222"/>
-          <w:kern w:val="0"/>
-          <w:sz w:val="23"/>
-          <w:szCs w:val="23"/>
-          <w14:ligatures w14:val="none"/>
-        </w:rPr>
-        <w:t>count_liked</w:t>
-      </w:r>
-      <w:proofErr w:type="spellEnd"/>
-      <w:r>
-        <w:rPr>
-          <w:rFonts w:ascii="Open Sans" w:eastAsia="Times New Roman" w:hAnsi="Open Sans" w:cs="Open Sans"/>
-          <w:color w:val="222222"/>
-          <w:kern w:val="0"/>
-          <w:sz w:val="23"/>
-          <w:szCs w:val="23"/>
-          <w14:ligatures w14:val="none"/>
-        </w:rPr>
-        <w:t xml:space="preserve">, </w:t>
-      </w:r>
-      <w:proofErr w:type="spellStart"/>
-      <w:r>
-        <w:rPr>
-          <w:rFonts w:ascii="Open Sans" w:eastAsia="Times New Roman" w:hAnsi="Open Sans" w:cs="Open Sans"/>
-          <w:color w:val="222222"/>
-          <w:kern w:val="0"/>
-          <w:sz w:val="23"/>
-          <w:szCs w:val="23"/>
-          <w14:ligatures w14:val="none"/>
-        </w:rPr>
-        <w:t>count_comment_no_liked</w:t>
-      </w:r>
-      <w:proofErr w:type="spellEnd"/>
-      <w:r>
-        <w:rPr>
-          <w:rFonts w:ascii="Open Sans" w:eastAsia="Times New Roman" w:hAnsi="Open Sans" w:cs="Open Sans"/>
-          <w:color w:val="222222"/>
-          <w:kern w:val="0"/>
-          <w:sz w:val="23"/>
-          <w:szCs w:val="23"/>
-          <w14:ligatures w14:val="none"/>
-        </w:rPr>
-        <w:t xml:space="preserve"> and </w:t>
-      </w:r>
-      <w:proofErr w:type="spellStart"/>
-      <w:r>
-        <w:rPr>
-          <w:rFonts w:ascii="Open Sans" w:eastAsia="Times New Roman" w:hAnsi="Open Sans" w:cs="Open Sans"/>
-          <w:color w:val="222222"/>
-          <w:kern w:val="0"/>
-          <w:sz w:val="23"/>
-          <w:szCs w:val="23"/>
-          <w14:ligatures w14:val="none"/>
-        </w:rPr>
-        <w:t>count_only_share</w:t>
-      </w:r>
-      <w:proofErr w:type="spellEnd"/>
-      <w:r>
-        <w:rPr>
-          <w:rFonts w:ascii="Open Sans" w:eastAsia="Times New Roman" w:hAnsi="Open Sans" w:cs="Open Sans"/>
-          <w:color w:val="222222"/>
-          <w:kern w:val="0"/>
-          <w:sz w:val="23"/>
-          <w:szCs w:val="23"/>
-          <w14:ligatures w14:val="none"/>
-        </w:rPr>
-        <w:t>.</w:t>
-      </w:r>
-    </w:p>
-    <w:p>
-      <w:pPr>
-        <w:shd w:val="clear" w:color="auto" w:fill="FFFFFF"/>
-        <w:spacing w:after="0" w:line="240" w:lineRule="auto"/>
-        <w:rPr>
-          <w:rFonts w:ascii="Open Sans" w:eastAsia="Times New Roman" w:hAnsi="Open Sans" w:cs="Open Sans"/>
-          <w:color w:val="222222"/>
-          <w:kern w:val="0"/>
-          <w:sz w:val="23"/>
-          <w:szCs w:val="23"/>
-          <w14:ligatures w14:val="none"/>
-        </w:rPr>
-      </w:pPr>
-    </w:p>
-    <w:p>
-      <w:pPr>
-        <w:shd w:val="clear" w:color="auto" w:fill="FFFFFF"/>
-        <w:spacing w:after="0" w:line="240" w:lineRule="auto"/>
-        <w:rPr>
-          <w:rFonts w:ascii="Open Sans" w:eastAsia="Times New Roman" w:hAnsi="Open Sans" w:cs="Open Sans"/>
-          <w:color w:val="222222"/>
-          <w:kern w:val="0"/>
-          <w:sz w:val="23"/>
-          <w:szCs w:val="23"/>
-          <w14:ligatures w14:val="none"/>
-        </w:rPr>
-      </w:pPr>
-      <w:r>
-        <w:rPr>
-          <w:rFonts w:ascii="Open Sans" w:eastAsia="Times New Roman" w:hAnsi="Open Sans" w:cs="Open Sans"/>
-          <w:color w:val="222222"/>
-          <w:kern w:val="0"/>
-          <w:sz w:val="23"/>
-          <w:szCs w:val="23"/>
-          <w14:ligatures w14:val="none"/>
-        </w:rPr>
-        <w:t xml:space="preserve">The Big-O complexity is </w:t>
-      </w:r>
-      <w:r>
-        <w:rPr>
-          <w:rFonts w:ascii="Open Sans" w:eastAsia="Times New Roman" w:hAnsi="Open Sans" w:cs="Open Sans"/>
-          <w:color w:val="222222"/>
-          <w:kern w:val="0"/>
-          <w:sz w:val="23"/>
-          <w:szCs w:val="23"/>
-          <w14:ligatures w14:val="none"/>
-        </w:rPr>
-        <w:t>O(n</w:t>
-      </w:r>
-      <w:r>
+        <w:t xml:space="preserve">s*l </w:t>
+      </w:r>
+      <w:r>
+        <w:rPr>
+          <w:rFonts w:ascii="Open Sans" w:eastAsia="Times New Roman" w:hAnsi="Open Sans" w:cs="Open Sans"/>
+          <w:color w:val="222222"/>
+          <w:kern w:val="0"/>
+          <w:sz w:val="23"/>
+          <w:szCs w:val="23"/>
+          <w14:ligatures w14:val="none"/>
+        </w:rPr>
+        <w:t>+ c*</w:t>
+      </w:r>
+      <w:proofErr w:type="gramStart"/>
+      <w:r>
+        <w:rPr>
+          <w:rFonts w:ascii="Open Sans" w:eastAsia="Times New Roman" w:hAnsi="Open Sans" w:cs="Open Sans"/>
+          <w:color w:val="222222"/>
+          <w:kern w:val="0"/>
+          <w:sz w:val="23"/>
+          <w:szCs w:val="23"/>
+          <w14:ligatures w14:val="none"/>
+        </w:rPr>
+        <w:t>s )</w:t>
+      </w:r>
+      <w:proofErr w:type="gramEnd"/>
+    </w:p>
+    <w:p>
+      <w:pPr>
+        <w:shd w:val="clear" w:color="auto" w:fill="FFFFFF"/>
+        <w:spacing w:after="0" w:line="240" w:lineRule="auto"/>
         <w:rPr>
           <w:rFonts w:ascii="Open Sans" w:eastAsia="Times New Roman" w:hAnsi="Open Sans" w:cs="Open Sans"/>
           <w:color w:val="222222"/>
@@ -2471,48 +2996,14 @@
           <w:vertAlign w:val="superscript"/>
           <w14:ligatures w14:val="none"/>
         </w:rPr>
-        <w:t>2</w:t>
-      </w:r>
-      <w:r>
-        <w:rPr>
-          <w:rFonts w:ascii="Open Sans" w:eastAsia="Times New Roman" w:hAnsi="Open Sans" w:cs="Open Sans"/>
-          <w:color w:val="222222"/>
-          <w:kern w:val="0"/>
-          <w:sz w:val="23"/>
-          <w:szCs w:val="23"/>
-          <w14:ligatures w14:val="none"/>
-        </w:rPr>
-        <w:t xml:space="preserve">) </w:t>
-      </w:r>
-      <w:r>
-        <w:rPr>
-          <w:rFonts w:ascii="Open Sans" w:eastAsia="Times New Roman" w:hAnsi="Open Sans" w:cs="Open Sans"/>
-          <w:color w:val="222222"/>
-          <w:kern w:val="0"/>
-          <w:sz w:val="23"/>
-          <w:szCs w:val="23"/>
-          <w14:ligatures w14:val="none"/>
-        </w:rPr>
-        <w:t xml:space="preserve">because </w:t>
-      </w:r>
-      <w:r>
-        <w:rPr>
-          <w:rFonts w:ascii="Open Sans" w:eastAsia="Times New Roman" w:hAnsi="Open Sans" w:cs="Open Sans"/>
-          <w:color w:val="222222"/>
-          <w:kern w:val="0"/>
-          <w:sz w:val="23"/>
-          <w:szCs w:val="23"/>
-          <w14:ligatures w14:val="none"/>
-        </w:rPr>
-        <w:t xml:space="preserve">if l, c and s grow proportionally with the input size n, the dominant term are quadratic terms. Lower-order terms like n log n could be ignored in Big-O notation. </w:t>
-      </w:r>
-    </w:p>
-    <w:p>
-      <w:pPr>
-        <w:shd w:val="clear" w:color="auto" w:fill="FFFFFF"/>
-        <w:spacing w:after="0" w:line="240" w:lineRule="auto"/>
-        <w:rPr>
-          <w:rFonts w:ascii="Open Sans" w:eastAsia="Times New Roman" w:hAnsi="Open Sans" w:cs="Open Sans" w:hint="eastAsia"/>
+      </w:pPr>
+    </w:p>
+    <w:p>
+      <w:pPr>
+        <w:shd w:val="clear" w:color="auto" w:fill="FFFFFF"/>
+        <w:spacing w:after="0" w:line="240" w:lineRule="auto"/>
+        <w:rPr>
+          <w:rFonts w:ascii="Open Sans" w:eastAsia="Times New Roman" w:hAnsi="Open Sans" w:cs="Open Sans"/>
           <w:color w:val="222222"/>
           <w:kern w:val="0"/>
           <w:sz w:val="23"/>
@@ -2724,7 +3215,12 @@
           <w14:ligatures w14:val="none"/>
         </w:rPr>
       </w:pPr>
-      <w:r>
+    </w:p>
+    <w:p>
+      <w:pPr>
+        <w:shd w:val="clear" w:color="auto" w:fill="FFFFFF"/>
+        <w:spacing w:after="0" w:line="240" w:lineRule="auto"/>
+        <w:outlineLvl w:val="1"/>
         <w:rPr>
           <w:rFonts w:ascii="Open Sans" w:eastAsia="Times New Roman" w:hAnsi="Open Sans" w:cs="Open Sans"/>
           <w:color w:val="222222"/>
@@ -2733,6 +3229,32 @@
           <w:szCs w:val="32"/>
           <w14:ligatures w14:val="none"/>
         </w:rPr>
+      </w:pPr>
+    </w:p>
+    <w:p>
+      <w:pPr>
+        <w:shd w:val="clear" w:color="auto" w:fill="FFFFFF"/>
+        <w:spacing w:after="0" w:line="240" w:lineRule="auto"/>
+        <w:outlineLvl w:val="1"/>
+        <w:rPr>
+          <w:rFonts w:ascii="Open Sans" w:eastAsia="Times New Roman" w:hAnsi="Open Sans" w:cs="Open Sans"/>
+          <w:color w:val="222222"/>
+          <w:kern w:val="0"/>
+          <w:sz w:val="32"/>
+          <w:szCs w:val="32"/>
+          <w14:ligatures w14:val="none"/>
+        </w:rPr>
+      </w:pPr>
+      <w:r>
+        <w:rPr>
+          <w:rFonts w:ascii="Open Sans" w:eastAsia="Times New Roman" w:hAnsi="Open Sans" w:cs="Open Sans"/>
+          <w:color w:val="222222"/>
+          <w:kern w:val="0"/>
+          <w:sz w:val="32"/>
+          <w:szCs w:val="32"/>
+          <w14:ligatures w14:val="none"/>
+        </w:rPr>
+        <w:lastRenderedPageBreak/>
         <w:t>Evidence of Measurement</w:t>
       </w:r>
     </w:p>
@@ -2758,9 +3280,8 @@
           <w:sz w:val="23"/>
           <w:szCs w:val="23"/>
         </w:rPr>
-        <w:lastRenderedPageBreak/>
         <w:drawing>
-          <wp:inline distT="0" distB="0" distL="0" distR="0" wp14:anchorId="37421B0D" wp14:editId="764AD9C6">
+          <wp:inline distT="0" distB="0" distL="0" distR="0" wp14:anchorId="37421B0D" wp14:editId="3B9616FD">
             <wp:extent cx="5731510" cy="5656580"/>
             <wp:effectExtent l="0" t="0" r="0" b="0"/>
             <wp:docPr id="334363113" name="Picture 1"/>
@@ -3180,7 +3701,12 @@
           <w14:ligatures w14:val="none"/>
         </w:rPr>
       </w:pPr>
-      <w:r>
+    </w:p>
+    <w:p>
+      <w:pPr>
+        <w:shd w:val="clear" w:color="auto" w:fill="FFFFFF"/>
+        <w:spacing w:after="0" w:line="240" w:lineRule="auto"/>
+        <w:outlineLvl w:val="1"/>
         <w:rPr>
           <w:rFonts w:ascii="Open Sans" w:eastAsia="Times New Roman" w:hAnsi="Open Sans" w:cs="Open Sans"/>
           <w:color w:val="222222"/>
@@ -3189,593 +3715,6 @@
           <w:szCs w:val="32"/>
           <w14:ligatures w14:val="none"/>
         </w:rPr>
-        <w:t>Conclusion</w:t>
-      </w:r>
-    </w:p>
-    <w:p>
-      <w:pPr>
-        <w:shd w:val="clear" w:color="auto" w:fill="FFFFFF"/>
-        <w:spacing w:after="0" w:line="240" w:lineRule="auto"/>
-        <w:rPr>
-          <w:rFonts w:ascii="Open Sans" w:eastAsia="Times New Roman" w:hAnsi="Open Sans" w:cs="Open Sans"/>
-          <w:color w:val="222222"/>
-          <w:kern w:val="0"/>
-          <w:sz w:val="23"/>
-          <w:szCs w:val="23"/>
-          <w14:ligatures w14:val="none"/>
-        </w:rPr>
-      </w:pPr>
-    </w:p>
-    <w:p>
-      <w:pPr>
-        <w:shd w:val="clear" w:color="auto" w:fill="FFFFFF"/>
-        <w:spacing w:after="0" w:line="240" w:lineRule="auto"/>
-        <w:rPr>
-          <w:rFonts w:ascii="Open Sans" w:eastAsia="Times New Roman" w:hAnsi="Open Sans" w:cs="Open Sans"/>
-          <w:color w:val="222222"/>
-          <w:kern w:val="0"/>
-          <w:sz w:val="23"/>
-          <w:szCs w:val="23"/>
-          <w14:ligatures w14:val="none"/>
-        </w:rPr>
-      </w:pPr>
-      <w:r>
-        <w:rPr>
-          <w:rFonts w:ascii="Open Sans" w:eastAsia="Times New Roman" w:hAnsi="Open Sans" w:cs="Open Sans" w:hint="eastAsia"/>
-          <w:color w:val="222222"/>
-          <w:kern w:val="0"/>
-          <w:sz w:val="23"/>
-          <w:szCs w:val="23"/>
-          <w14:ligatures w14:val="none"/>
-        </w:rPr>
-        <w:lastRenderedPageBreak/>
-        <w:t>If</w:t>
-      </w:r>
-      <w:r>
-        <w:rPr>
-          <w:rFonts w:ascii="Open Sans" w:eastAsia="Times New Roman" w:hAnsi="Open Sans" w:cs="Open Sans"/>
-          <w:color w:val="222222"/>
-          <w:kern w:val="0"/>
-          <w:sz w:val="23"/>
-          <w:szCs w:val="23"/>
-          <w14:ligatures w14:val="none"/>
-        </w:rPr>
-        <w:t xml:space="preserve"> a different input were sorted instead of likes, the final big-O notation would still be O (n</w:t>
-      </w:r>
-      <w:r>
-        <w:rPr>
-          <w:rFonts w:ascii="Open Sans" w:eastAsia="Times New Roman" w:hAnsi="Open Sans" w:cs="Open Sans"/>
-          <w:color w:val="222222"/>
-          <w:kern w:val="0"/>
-          <w:sz w:val="23"/>
-          <w:szCs w:val="23"/>
-          <w:vertAlign w:val="superscript"/>
-          <w14:ligatures w14:val="none"/>
-        </w:rPr>
-        <w:t>2</w:t>
-      </w:r>
-      <w:r>
-        <w:rPr>
-          <w:rFonts w:ascii="Open Sans" w:eastAsia="Times New Roman" w:hAnsi="Open Sans" w:cs="Open Sans"/>
-          <w:color w:val="222222"/>
-          <w:kern w:val="0"/>
-          <w:sz w:val="23"/>
-          <w:szCs w:val="23"/>
-          <w14:ligatures w14:val="none"/>
-        </w:rPr>
-        <w:t xml:space="preserve">). This is mainly because bubble sort itself has a complexity of </w:t>
-      </w:r>
-      <w:r>
-        <w:rPr>
-          <w:rFonts w:ascii="Open Sans" w:eastAsia="Times New Roman" w:hAnsi="Open Sans" w:cs="Open Sans"/>
-          <w:color w:val="222222"/>
-          <w:kern w:val="0"/>
-          <w:sz w:val="23"/>
-          <w:szCs w:val="23"/>
-          <w14:ligatures w14:val="none"/>
-        </w:rPr>
-        <w:t>O (n</w:t>
-      </w:r>
-      <w:r>
-        <w:rPr>
-          <w:rFonts w:ascii="Open Sans" w:eastAsia="Times New Roman" w:hAnsi="Open Sans" w:cs="Open Sans"/>
-          <w:color w:val="222222"/>
-          <w:kern w:val="0"/>
-          <w:sz w:val="23"/>
-          <w:szCs w:val="23"/>
-          <w:vertAlign w:val="superscript"/>
-          <w14:ligatures w14:val="none"/>
-        </w:rPr>
-        <w:t>2</w:t>
-      </w:r>
-      <w:r>
-        <w:rPr>
-          <w:rFonts w:ascii="Open Sans" w:eastAsia="Times New Roman" w:hAnsi="Open Sans" w:cs="Open Sans"/>
-          <w:color w:val="222222"/>
-          <w:kern w:val="0"/>
-          <w:sz w:val="23"/>
-          <w:szCs w:val="23"/>
-          <w14:ligatures w14:val="none"/>
-        </w:rPr>
-        <w:t>)</w:t>
-      </w:r>
-      <w:r>
-        <w:rPr>
-          <w:rFonts w:ascii="Open Sans" w:eastAsia="Times New Roman" w:hAnsi="Open Sans" w:cs="Open Sans"/>
-          <w:color w:val="222222"/>
-          <w:kern w:val="0"/>
-          <w:sz w:val="23"/>
-          <w:szCs w:val="23"/>
-          <w14:ligatures w14:val="none"/>
-        </w:rPr>
-        <w:t xml:space="preserve">, and the remaining functions still contain combination of loops and linear search produces </w:t>
-      </w:r>
-      <w:r>
-        <w:rPr>
-          <w:rFonts w:ascii="Open Sans" w:eastAsia="Times New Roman" w:hAnsi="Open Sans" w:cs="Open Sans"/>
-          <w:color w:val="222222"/>
-          <w:kern w:val="0"/>
-          <w:sz w:val="23"/>
-          <w:szCs w:val="23"/>
-          <w14:ligatures w14:val="none"/>
-        </w:rPr>
-        <w:t>quadratic behaviour. The actual execution time depends on the relative size of likes, comments and shares and how often each array is searched.</w:t>
-      </w:r>
-    </w:p>
-    <w:p>
-      <w:pPr>
-        <w:shd w:val="clear" w:color="auto" w:fill="FFFFFF"/>
-        <w:spacing w:after="0" w:line="240" w:lineRule="auto"/>
-        <w:rPr>
-          <w:rFonts w:ascii="Open Sans" w:eastAsia="Times New Roman" w:hAnsi="Open Sans" w:cs="Open Sans"/>
-          <w:color w:val="222222"/>
-          <w:kern w:val="0"/>
-          <w:sz w:val="23"/>
-          <w:szCs w:val="23"/>
-          <w14:ligatures w14:val="none"/>
-        </w:rPr>
-      </w:pPr>
-    </w:p>
-    <w:p>
-      <w:pPr>
-        <w:shd w:val="clear" w:color="auto" w:fill="FFFFFF"/>
-        <w:spacing w:after="0" w:line="240" w:lineRule="auto"/>
-        <w:rPr>
-          <w:rFonts w:ascii="Open Sans" w:eastAsia="Times New Roman" w:hAnsi="Open Sans" w:cs="Open Sans"/>
-          <w:color w:val="222222"/>
-          <w:kern w:val="0"/>
-          <w:sz w:val="23"/>
-          <w:szCs w:val="23"/>
-          <w14:ligatures w14:val="none"/>
-        </w:rPr>
-      </w:pPr>
-      <w:r>
-        <w:rPr>
-          <w:rFonts w:ascii="Open Sans" w:eastAsia="Times New Roman" w:hAnsi="Open Sans" w:cs="Open Sans"/>
-          <w:color w:val="222222"/>
-          <w:kern w:val="0"/>
-          <w:sz w:val="23"/>
-          <w:szCs w:val="23"/>
-          <w14:ligatures w14:val="none"/>
-        </w:rPr>
-        <w:t>(l-1) *l / 2 + l*(c + s) + c*(log</w:t>
-      </w:r>
-      <w:r>
-        <w:rPr>
-          <w:rFonts w:ascii="Open Sans" w:eastAsia="Times New Roman" w:hAnsi="Open Sans" w:cs="Open Sans"/>
-          <w:color w:val="222222"/>
-          <w:kern w:val="0"/>
-          <w:sz w:val="23"/>
-          <w:szCs w:val="23"/>
-          <w:vertAlign w:val="subscript"/>
-          <w14:ligatures w14:val="none"/>
-        </w:rPr>
-        <w:t>2</w:t>
-      </w:r>
-      <w:r>
-        <w:rPr>
-          <w:rFonts w:ascii="Open Sans" w:eastAsia="Times New Roman" w:hAnsi="Open Sans" w:cs="Open Sans"/>
-          <w:color w:val="222222"/>
-          <w:kern w:val="0"/>
-          <w:sz w:val="23"/>
-          <w:szCs w:val="23"/>
-          <w14:ligatures w14:val="none"/>
-        </w:rPr>
-        <w:t>l + s) + s*(log</w:t>
-      </w:r>
-      <w:r>
-        <w:rPr>
-          <w:rFonts w:ascii="Open Sans" w:eastAsia="Times New Roman" w:hAnsi="Open Sans" w:cs="Open Sans"/>
-          <w:color w:val="222222"/>
-          <w:kern w:val="0"/>
-          <w:sz w:val="23"/>
-          <w:szCs w:val="23"/>
-          <w:vertAlign w:val="subscript"/>
-          <w14:ligatures w14:val="none"/>
-        </w:rPr>
-        <w:t>2</w:t>
-      </w:r>
-      <w:r>
-        <w:rPr>
-          <w:rFonts w:ascii="Open Sans" w:eastAsia="Times New Roman" w:hAnsi="Open Sans" w:cs="Open Sans"/>
-          <w:color w:val="222222"/>
-          <w:kern w:val="0"/>
-          <w:sz w:val="23"/>
-          <w:szCs w:val="23"/>
-          <w14:ligatures w14:val="none"/>
-        </w:rPr>
-        <w:t>l+c)</w:t>
-      </w:r>
-      <w:r>
-        <w:rPr>
-          <w:rFonts w:ascii="Open Sans" w:eastAsia="Times New Roman" w:hAnsi="Open Sans" w:cs="Open Sans"/>
-          <w:color w:val="222222"/>
-          <w:kern w:val="0"/>
-          <w:sz w:val="23"/>
-          <w:szCs w:val="23"/>
-          <w14:ligatures w14:val="none"/>
-        </w:rPr>
-        <w:t xml:space="preserve"> </w:t>
-      </w:r>
-    </w:p>
-    <w:p>
-      <w:pPr>
-        <w:shd w:val="clear" w:color="auto" w:fill="FFFFFF"/>
-        <w:spacing w:after="0" w:line="240" w:lineRule="auto"/>
-        <w:rPr>
-          <w:rFonts w:ascii="Open Sans" w:eastAsia="Times New Roman" w:hAnsi="Open Sans" w:cs="Open Sans"/>
-          <w:color w:val="222222"/>
-          <w:kern w:val="0"/>
-          <w:sz w:val="23"/>
-          <w:szCs w:val="23"/>
-          <w14:ligatures w14:val="none"/>
-        </w:rPr>
-      </w:pPr>
-      <w:r>
-        <w:rPr>
-          <w:rFonts w:ascii="Open Sans" w:eastAsia="Times New Roman" w:hAnsi="Open Sans" w:cs="Open Sans"/>
-          <w:color w:val="222222"/>
-          <w:kern w:val="0"/>
-          <w:sz w:val="23"/>
-          <w:szCs w:val="23"/>
-          <w14:ligatures w14:val="none"/>
-        </w:rPr>
-        <w:t>= l</w:t>
-      </w:r>
-      <w:r>
-        <w:rPr>
-          <w:rFonts w:ascii="Open Sans" w:eastAsia="Times New Roman" w:hAnsi="Open Sans" w:cs="Open Sans"/>
-          <w:color w:val="222222"/>
-          <w:kern w:val="0"/>
-          <w:sz w:val="23"/>
-          <w:szCs w:val="23"/>
-          <w:vertAlign w:val="subscript"/>
-          <w14:ligatures w14:val="none"/>
-        </w:rPr>
-        <w:t>2</w:t>
-      </w:r>
-      <w:r>
-        <w:rPr>
-          <w:rFonts w:ascii="Open Sans" w:eastAsia="Times New Roman" w:hAnsi="Open Sans" w:cs="Open Sans"/>
-          <w:color w:val="222222"/>
-          <w:kern w:val="0"/>
-          <w:sz w:val="23"/>
-          <w:szCs w:val="23"/>
-          <w14:ligatures w14:val="none"/>
-        </w:rPr>
-        <w:t>/2 – l/2 + l*c + l*s + 2 * c*s + (</w:t>
-      </w:r>
-      <w:proofErr w:type="spellStart"/>
-      <w:r>
-        <w:rPr>
-          <w:rFonts w:ascii="Open Sans" w:eastAsia="Times New Roman" w:hAnsi="Open Sans" w:cs="Open Sans"/>
-          <w:color w:val="222222"/>
-          <w:kern w:val="0"/>
-          <w:sz w:val="23"/>
-          <w:szCs w:val="23"/>
-          <w14:ligatures w14:val="none"/>
-        </w:rPr>
-        <w:t>c+</w:t>
-      </w:r>
-      <w:proofErr w:type="gramStart"/>
-      <w:r>
-        <w:rPr>
-          <w:rFonts w:ascii="Open Sans" w:eastAsia="Times New Roman" w:hAnsi="Open Sans" w:cs="Open Sans"/>
-          <w:color w:val="222222"/>
-          <w:kern w:val="0"/>
-          <w:sz w:val="23"/>
-          <w:szCs w:val="23"/>
-          <w14:ligatures w14:val="none"/>
-        </w:rPr>
-        <w:t>s</w:t>
-      </w:r>
-      <w:proofErr w:type="spellEnd"/>
-      <w:r>
-        <w:rPr>
-          <w:rFonts w:ascii="Open Sans" w:eastAsia="Times New Roman" w:hAnsi="Open Sans" w:cs="Open Sans"/>
-          <w:color w:val="222222"/>
-          <w:kern w:val="0"/>
-          <w:sz w:val="23"/>
-          <w:szCs w:val="23"/>
-          <w14:ligatures w14:val="none"/>
-        </w:rPr>
-        <w:t>)*</w:t>
-      </w:r>
-      <w:proofErr w:type="gramEnd"/>
-      <w:r>
-        <w:rPr>
-          <w:rFonts w:ascii="Open Sans" w:eastAsia="Times New Roman" w:hAnsi="Open Sans" w:cs="Open Sans"/>
-          <w:color w:val="222222"/>
-          <w:kern w:val="0"/>
-          <w:sz w:val="23"/>
-          <w:szCs w:val="23"/>
-          <w14:ligatures w14:val="none"/>
-        </w:rPr>
-        <w:t>log</w:t>
-      </w:r>
-      <w:r>
-        <w:rPr>
-          <w:rFonts w:ascii="Open Sans" w:eastAsia="Times New Roman" w:hAnsi="Open Sans" w:cs="Open Sans"/>
-          <w:color w:val="222222"/>
-          <w:kern w:val="0"/>
-          <w:sz w:val="23"/>
-          <w:szCs w:val="23"/>
-          <w:vertAlign w:val="subscript"/>
-          <w14:ligatures w14:val="none"/>
-        </w:rPr>
-        <w:t>2</w:t>
-      </w:r>
-      <w:r>
-        <w:rPr>
-          <w:rFonts w:ascii="Open Sans" w:eastAsia="Times New Roman" w:hAnsi="Open Sans" w:cs="Open Sans"/>
-          <w:color w:val="222222"/>
-          <w:kern w:val="0"/>
-          <w:sz w:val="23"/>
-          <w:szCs w:val="23"/>
-          <w14:ligatures w14:val="none"/>
-        </w:rPr>
-        <w:t xml:space="preserve">l </w:t>
-      </w:r>
-    </w:p>
-    <w:p>
-      <w:pPr>
-        <w:shd w:val="clear" w:color="auto" w:fill="FFFFFF"/>
-        <w:spacing w:after="0" w:line="240" w:lineRule="auto"/>
-        <w:rPr>
-          <w:rFonts w:ascii="Open Sans" w:eastAsia="Times New Roman" w:hAnsi="Open Sans" w:cs="Open Sans"/>
-          <w:color w:val="222222"/>
-          <w:kern w:val="0"/>
-          <w:sz w:val="23"/>
-          <w:szCs w:val="23"/>
-          <w14:ligatures w14:val="none"/>
-        </w:rPr>
-      </w:pPr>
-      <w:r>
-        <w:rPr>
-          <w:rFonts w:ascii="Open Sans" w:eastAsia="Times New Roman" w:hAnsi="Open Sans" w:cs="Open Sans"/>
-          <w:color w:val="222222"/>
-          <w:kern w:val="0"/>
-          <w:sz w:val="23"/>
-          <w:szCs w:val="23"/>
-          <w14:ligatures w14:val="none"/>
-        </w:rPr>
-        <w:t>=</w:t>
-      </w:r>
-      <w:r>
-        <w:rPr>
-          <w:rFonts w:ascii="Open Sans" w:eastAsia="Times New Roman" w:hAnsi="Open Sans" w:cs="Open Sans"/>
-          <w:color w:val="222222"/>
-          <w:kern w:val="0"/>
-          <w:sz w:val="23"/>
-          <w:szCs w:val="23"/>
-          <w14:ligatures w14:val="none"/>
-        </w:rPr>
-        <w:t xml:space="preserve"> </w:t>
-      </w:r>
-      <w:r>
-        <w:rPr>
-          <w:rFonts w:ascii="Open Sans" w:eastAsia="Times New Roman" w:hAnsi="Open Sans" w:cs="Open Sans"/>
-          <w:color w:val="222222"/>
-          <w:kern w:val="0"/>
-          <w:sz w:val="23"/>
-          <w:szCs w:val="23"/>
-          <w14:ligatures w14:val="none"/>
-        </w:rPr>
-        <w:t>l</w:t>
-      </w:r>
-      <w:r>
-        <w:rPr>
-          <w:rFonts w:ascii="Open Sans" w:eastAsia="Times New Roman" w:hAnsi="Open Sans" w:cs="Open Sans"/>
-          <w:color w:val="222222"/>
-          <w:kern w:val="0"/>
-          <w:sz w:val="23"/>
-          <w:szCs w:val="23"/>
-          <w:vertAlign w:val="subscript"/>
-          <w14:ligatures w14:val="none"/>
-        </w:rPr>
-        <w:t>2</w:t>
-      </w:r>
-      <w:r>
-        <w:rPr>
-          <w:rFonts w:ascii="Open Sans" w:eastAsia="Times New Roman" w:hAnsi="Open Sans" w:cs="Open Sans"/>
-          <w:color w:val="222222"/>
-          <w:kern w:val="0"/>
-          <w:sz w:val="23"/>
-          <w:szCs w:val="23"/>
-          <w14:ligatures w14:val="none"/>
-        </w:rPr>
-        <w:t>/2 – l/2 + 2 * c*s + (</w:t>
-      </w:r>
-      <w:proofErr w:type="spellStart"/>
-      <w:r>
-        <w:rPr>
-          <w:rFonts w:ascii="Open Sans" w:eastAsia="Times New Roman" w:hAnsi="Open Sans" w:cs="Open Sans"/>
-          <w:color w:val="222222"/>
-          <w:kern w:val="0"/>
-          <w:sz w:val="23"/>
-          <w:szCs w:val="23"/>
-          <w14:ligatures w14:val="none"/>
-        </w:rPr>
-        <w:t>c+</w:t>
-      </w:r>
-      <w:proofErr w:type="gramStart"/>
-      <w:r>
-        <w:rPr>
-          <w:rFonts w:ascii="Open Sans" w:eastAsia="Times New Roman" w:hAnsi="Open Sans" w:cs="Open Sans"/>
-          <w:color w:val="222222"/>
-          <w:kern w:val="0"/>
-          <w:sz w:val="23"/>
-          <w:szCs w:val="23"/>
-          <w14:ligatures w14:val="none"/>
-        </w:rPr>
-        <w:t>s</w:t>
-      </w:r>
-      <w:proofErr w:type="spellEnd"/>
-      <w:r>
-        <w:rPr>
-          <w:rFonts w:ascii="Open Sans" w:eastAsia="Times New Roman" w:hAnsi="Open Sans" w:cs="Open Sans"/>
-          <w:color w:val="222222"/>
-          <w:kern w:val="0"/>
-          <w:sz w:val="23"/>
-          <w:szCs w:val="23"/>
-          <w14:ligatures w14:val="none"/>
-        </w:rPr>
-        <w:t>)*</w:t>
-      </w:r>
-      <w:proofErr w:type="gramEnd"/>
-      <w:r>
-        <w:rPr>
-          <w:rFonts w:ascii="Open Sans" w:eastAsia="Times New Roman" w:hAnsi="Open Sans" w:cs="Open Sans"/>
-          <w:color w:val="222222"/>
-          <w:kern w:val="0"/>
-          <w:sz w:val="23"/>
-          <w:szCs w:val="23"/>
-          <w14:ligatures w14:val="none"/>
-        </w:rPr>
-        <w:t>(</w:t>
-      </w:r>
-      <w:r>
-        <w:rPr>
-          <w:rFonts w:ascii="Open Sans" w:eastAsia="Times New Roman" w:hAnsi="Open Sans" w:cs="Open Sans"/>
-          <w:color w:val="222222"/>
-          <w:kern w:val="0"/>
-          <w:sz w:val="23"/>
-          <w:szCs w:val="23"/>
-          <w14:ligatures w14:val="none"/>
-        </w:rPr>
-        <w:t>log</w:t>
-      </w:r>
-      <w:r>
-        <w:rPr>
-          <w:rFonts w:ascii="Open Sans" w:eastAsia="Times New Roman" w:hAnsi="Open Sans" w:cs="Open Sans"/>
-          <w:color w:val="222222"/>
-          <w:kern w:val="0"/>
-          <w:sz w:val="23"/>
-          <w:szCs w:val="23"/>
-          <w:vertAlign w:val="subscript"/>
-          <w14:ligatures w14:val="none"/>
-        </w:rPr>
-        <w:t>2</w:t>
-      </w:r>
-      <w:r>
-        <w:rPr>
-          <w:rFonts w:ascii="Open Sans" w:eastAsia="Times New Roman" w:hAnsi="Open Sans" w:cs="Open Sans"/>
-          <w:color w:val="222222"/>
-          <w:kern w:val="0"/>
-          <w:sz w:val="23"/>
-          <w:szCs w:val="23"/>
-          <w14:ligatures w14:val="none"/>
-        </w:rPr>
-        <w:t xml:space="preserve">l </w:t>
-      </w:r>
-      <w:r>
-        <w:rPr>
-          <w:rFonts w:ascii="Open Sans" w:eastAsia="Times New Roman" w:hAnsi="Open Sans" w:cs="Open Sans"/>
-          <w:color w:val="222222"/>
-          <w:kern w:val="0"/>
-          <w:sz w:val="23"/>
-          <w:szCs w:val="23"/>
-          <w14:ligatures w14:val="none"/>
-        </w:rPr>
-        <w:t>+ l)</w:t>
-      </w:r>
-    </w:p>
-    <w:p>
-      <w:pPr>
-        <w:shd w:val="clear" w:color="auto" w:fill="FFFFFF"/>
-        <w:spacing w:after="0" w:line="240" w:lineRule="auto"/>
-        <w:rPr>
-          <w:rFonts w:ascii="Open Sans" w:eastAsia="Times New Roman" w:hAnsi="Open Sans" w:cs="Open Sans"/>
-          <w:color w:val="222222"/>
-          <w:kern w:val="0"/>
-          <w:sz w:val="23"/>
-          <w:szCs w:val="23"/>
-          <w14:ligatures w14:val="none"/>
-        </w:rPr>
-      </w:pPr>
-    </w:p>
-    <w:p>
-      <w:pPr>
-        <w:shd w:val="clear" w:color="auto" w:fill="FFFFFF"/>
-        <w:spacing w:after="0" w:line="240" w:lineRule="auto"/>
-        <w:rPr>
-          <w:rFonts w:ascii="Open Sans" w:eastAsia="Times New Roman" w:hAnsi="Open Sans" w:cs="Open Sans"/>
-          <w:color w:val="222222"/>
-          <w:kern w:val="0"/>
-          <w:sz w:val="23"/>
-          <w:szCs w:val="23"/>
-          <w14:ligatures w14:val="none"/>
-        </w:rPr>
-      </w:pPr>
-    </w:p>
-    <w:p>
-      <w:pPr>
-        <w:shd w:val="clear" w:color="auto" w:fill="FFFFFF"/>
-        <w:spacing w:after="0" w:line="240" w:lineRule="auto"/>
-        <w:rPr>
-          <w:rFonts w:ascii="Open Sans" w:eastAsia="Times New Roman" w:hAnsi="Open Sans" w:cs="Open Sans"/>
-          <w:color w:val="222222"/>
-          <w:kern w:val="0"/>
-          <w:sz w:val="23"/>
-          <w:szCs w:val="23"/>
-          <w14:ligatures w14:val="none"/>
-        </w:rPr>
-      </w:pPr>
-      <w:r>
-        <w:rPr>
-          <w:rFonts w:ascii="Open Sans" w:eastAsia="Times New Roman" w:hAnsi="Open Sans" w:cs="Open Sans"/>
-          <w:color w:val="222222"/>
-          <w:kern w:val="0"/>
-          <w:sz w:val="23"/>
-          <w:szCs w:val="23"/>
-          <w14:ligatures w14:val="none"/>
-        </w:rPr>
-        <w:t>The graph shows the measured execution time literally follows the same increasing trend as the estimated number of operations and theoretical complexity. As the input increases, all three lines grow at a similar quadratic rate</w:t>
-      </w:r>
-      <w:r>
-        <w:rPr>
-          <w:rFonts w:ascii="Open Sans" w:eastAsia="Times New Roman" w:hAnsi="Open Sans" w:cs="Open Sans"/>
-          <w:color w:val="222222"/>
-          <w:kern w:val="0"/>
-          <w:sz w:val="23"/>
-          <w:szCs w:val="23"/>
-          <w14:ligatures w14:val="none"/>
-        </w:rPr>
-        <w:t>.</w:t>
-      </w:r>
-    </w:p>
-    <w:p>
-      <w:pPr>
-        <w:shd w:val="clear" w:color="auto" w:fill="FFFFFF"/>
-        <w:spacing w:after="0" w:line="240" w:lineRule="auto"/>
-        <w:rPr>
-          <w:rFonts w:ascii="Open Sans" w:eastAsia="Times New Roman" w:hAnsi="Open Sans" w:cs="Open Sans" w:hint="eastAsia"/>
-          <w:color w:val="222222"/>
-          <w:kern w:val="0"/>
-          <w:sz w:val="23"/>
-          <w:szCs w:val="23"/>
-          <w14:ligatures w14:val="none"/>
-        </w:rPr>
       </w:pPr>
     </w:p>
     <w:p>
@@ -3801,6 +3740,677 @@
           <w:szCs w:val="32"/>
           <w14:ligatures w14:val="none"/>
         </w:rPr>
+        <w:lastRenderedPageBreak/>
+        <w:t>Conclusion</w:t>
+      </w:r>
+    </w:p>
+    <w:p>
+      <w:pPr>
+        <w:shd w:val="clear" w:color="auto" w:fill="FFFFFF"/>
+        <w:spacing w:after="0" w:line="240" w:lineRule="auto"/>
+        <w:rPr>
+          <w:rFonts w:ascii="Open Sans" w:eastAsia="Times New Roman" w:hAnsi="Open Sans" w:cs="Open Sans"/>
+          <w:color w:val="222222"/>
+          <w:kern w:val="0"/>
+          <w:sz w:val="23"/>
+          <w:szCs w:val="23"/>
+          <w14:ligatures w14:val="none"/>
+        </w:rPr>
+      </w:pPr>
+    </w:p>
+    <w:p>
+      <w:pPr>
+        <w:shd w:val="clear" w:color="auto" w:fill="FFFFFF"/>
+        <w:spacing w:after="0" w:line="240" w:lineRule="auto"/>
+        <w:rPr>
+          <w:rFonts w:ascii="Open Sans" w:eastAsia="Times New Roman" w:hAnsi="Open Sans" w:cs="Open Sans"/>
+          <w:color w:val="222222"/>
+          <w:kern w:val="0"/>
+          <w:sz w:val="23"/>
+          <w:szCs w:val="23"/>
+          <w14:ligatures w14:val="none"/>
+        </w:rPr>
+      </w:pPr>
+      <w:r>
+        <w:rPr>
+          <w:rFonts w:ascii="Open Sans" w:eastAsia="Times New Roman" w:hAnsi="Open Sans" w:cs="Open Sans" w:hint="eastAsia"/>
+          <w:color w:val="222222"/>
+          <w:kern w:val="0"/>
+          <w:sz w:val="23"/>
+          <w:szCs w:val="23"/>
+          <w14:ligatures w14:val="none"/>
+        </w:rPr>
+        <w:t>If</w:t>
+      </w:r>
+      <w:r>
+        <w:rPr>
+          <w:rFonts w:ascii="Open Sans" w:eastAsia="Times New Roman" w:hAnsi="Open Sans" w:cs="Open Sans"/>
+          <w:color w:val="222222"/>
+          <w:kern w:val="0"/>
+          <w:sz w:val="23"/>
+          <w:szCs w:val="23"/>
+          <w14:ligatures w14:val="none"/>
+        </w:rPr>
+        <w:t xml:space="preserve"> a different input were sorted instead of likes, the final big-O notation would still be </w:t>
+      </w:r>
+      <w:r>
+        <w:rPr>
+          <w:rFonts w:ascii="Open Sans" w:eastAsia="Times New Roman" w:hAnsi="Open Sans" w:cs="Open Sans"/>
+          <w:color w:val="222222"/>
+          <w:kern w:val="0"/>
+          <w:sz w:val="23"/>
+          <w:szCs w:val="23"/>
+          <w14:ligatures w14:val="none"/>
+        </w:rPr>
+        <w:t>O (l</w:t>
+      </w:r>
+      <w:r>
+        <w:rPr>
+          <w:rFonts w:ascii="Open Sans" w:eastAsia="Times New Roman" w:hAnsi="Open Sans" w:cs="Open Sans"/>
+          <w:color w:val="222222"/>
+          <w:kern w:val="0"/>
+          <w:sz w:val="23"/>
+          <w:szCs w:val="23"/>
+          <w:vertAlign w:val="superscript"/>
+          <w14:ligatures w14:val="none"/>
+        </w:rPr>
+        <w:t>2</w:t>
+      </w:r>
+      <w:r>
+        <w:rPr>
+          <w:rFonts w:ascii="Open Sans" w:eastAsia="Times New Roman" w:hAnsi="Open Sans" w:cs="Open Sans"/>
+          <w:color w:val="222222"/>
+          <w:kern w:val="0"/>
+          <w:sz w:val="23"/>
+          <w:szCs w:val="23"/>
+          <w14:ligatures w14:val="none"/>
+        </w:rPr>
+        <w:t xml:space="preserve"> + c*l </w:t>
+      </w:r>
+      <w:r>
+        <w:rPr>
+          <w:rFonts w:ascii="Open Sans" w:eastAsia="Times New Roman" w:hAnsi="Open Sans" w:cs="Open Sans"/>
+          <w:color w:val="222222"/>
+          <w:kern w:val="0"/>
+          <w:sz w:val="23"/>
+          <w:szCs w:val="23"/>
+          <w14:ligatures w14:val="none"/>
+        </w:rPr>
+        <w:t>+</w:t>
+      </w:r>
+      <w:r>
+        <w:rPr>
+          <w:rFonts w:ascii="Open Sans" w:eastAsia="Times New Roman" w:hAnsi="Open Sans" w:cs="Open Sans"/>
+          <w:color w:val="222222"/>
+          <w:kern w:val="0"/>
+          <w:sz w:val="23"/>
+          <w:szCs w:val="23"/>
+          <w14:ligatures w14:val="none"/>
+        </w:rPr>
+        <w:t xml:space="preserve"> s*l + c*</w:t>
+      </w:r>
+      <w:proofErr w:type="gramStart"/>
+      <w:r>
+        <w:rPr>
+          <w:rFonts w:ascii="Open Sans" w:eastAsia="Times New Roman" w:hAnsi="Open Sans" w:cs="Open Sans"/>
+          <w:color w:val="222222"/>
+          <w:kern w:val="0"/>
+          <w:sz w:val="23"/>
+          <w:szCs w:val="23"/>
+          <w14:ligatures w14:val="none"/>
+        </w:rPr>
+        <w:t>s )</w:t>
+      </w:r>
+      <w:proofErr w:type="gramEnd"/>
+      <w:r>
+        <w:rPr>
+          <w:rFonts w:ascii="Open Sans" w:eastAsia="Times New Roman" w:hAnsi="Open Sans" w:cs="Open Sans"/>
+          <w:color w:val="222222"/>
+          <w:kern w:val="0"/>
+          <w:sz w:val="23"/>
+          <w:szCs w:val="23"/>
+          <w14:ligatures w14:val="none"/>
+        </w:rPr>
+        <w:t xml:space="preserve">. This is mainly because bubble sort itself has a complexity of </w:t>
+      </w:r>
+      <w:r>
+        <w:rPr>
+          <w:rFonts w:ascii="Open Sans" w:eastAsia="Times New Roman" w:hAnsi="Open Sans" w:cs="Open Sans"/>
+          <w:color w:val="222222"/>
+          <w:kern w:val="0"/>
+          <w:sz w:val="23"/>
+          <w:szCs w:val="23"/>
+          <w14:ligatures w14:val="none"/>
+        </w:rPr>
+        <w:t>O (l</w:t>
+      </w:r>
+      <w:r>
+        <w:rPr>
+          <w:rFonts w:ascii="Open Sans" w:eastAsia="Times New Roman" w:hAnsi="Open Sans" w:cs="Open Sans"/>
+          <w:color w:val="222222"/>
+          <w:kern w:val="0"/>
+          <w:sz w:val="23"/>
+          <w:szCs w:val="23"/>
+          <w:vertAlign w:val="superscript"/>
+          <w14:ligatures w14:val="none"/>
+        </w:rPr>
+        <w:t>2</w:t>
+      </w:r>
+      <w:r>
+        <w:rPr>
+          <w:rFonts w:ascii="Open Sans" w:eastAsia="Times New Roman" w:hAnsi="Open Sans" w:cs="Open Sans"/>
+          <w:color w:val="222222"/>
+          <w:kern w:val="0"/>
+          <w:sz w:val="23"/>
+          <w:szCs w:val="23"/>
+          <w14:ligatures w14:val="none"/>
+        </w:rPr>
+        <w:t xml:space="preserve"> + c*l </w:t>
+      </w:r>
+      <w:r>
+        <w:rPr>
+          <w:rFonts w:ascii="Open Sans" w:eastAsia="Times New Roman" w:hAnsi="Open Sans" w:cs="Open Sans"/>
+          <w:color w:val="222222"/>
+          <w:kern w:val="0"/>
+          <w:sz w:val="23"/>
+          <w:szCs w:val="23"/>
+          <w14:ligatures w14:val="none"/>
+        </w:rPr>
+        <w:t>+</w:t>
+      </w:r>
+      <w:r>
+        <w:rPr>
+          <w:rFonts w:ascii="Open Sans" w:eastAsia="Times New Roman" w:hAnsi="Open Sans" w:cs="Open Sans"/>
+          <w:color w:val="222222"/>
+          <w:kern w:val="0"/>
+          <w:sz w:val="23"/>
+          <w:szCs w:val="23"/>
+          <w14:ligatures w14:val="none"/>
+        </w:rPr>
+        <w:t xml:space="preserve"> s*l + c*</w:t>
+      </w:r>
+      <w:proofErr w:type="gramStart"/>
+      <w:r>
+        <w:rPr>
+          <w:rFonts w:ascii="Open Sans" w:eastAsia="Times New Roman" w:hAnsi="Open Sans" w:cs="Open Sans"/>
+          <w:color w:val="222222"/>
+          <w:kern w:val="0"/>
+          <w:sz w:val="23"/>
+          <w:szCs w:val="23"/>
+          <w14:ligatures w14:val="none"/>
+        </w:rPr>
+        <w:t>s )</w:t>
+      </w:r>
+      <w:proofErr w:type="gramEnd"/>
+      <w:r>
+        <w:rPr>
+          <w:rFonts w:ascii="Open Sans" w:eastAsia="Times New Roman" w:hAnsi="Open Sans" w:cs="Open Sans"/>
+          <w:color w:val="222222"/>
+          <w:kern w:val="0"/>
+          <w:sz w:val="23"/>
+          <w:szCs w:val="23"/>
+          <w14:ligatures w14:val="none"/>
+        </w:rPr>
+        <w:t xml:space="preserve">, and the remaining functions still contain combination of loops and linear search produces </w:t>
+      </w:r>
+      <w:r>
+        <w:rPr>
+          <w:rFonts w:ascii="Open Sans" w:eastAsia="Times New Roman" w:hAnsi="Open Sans" w:cs="Open Sans"/>
+          <w:color w:val="222222"/>
+          <w:kern w:val="0"/>
+          <w:sz w:val="23"/>
+          <w:szCs w:val="23"/>
+          <w14:ligatures w14:val="none"/>
+        </w:rPr>
+        <w:t>quadratic behaviour. The actual execution time depends on the relative size of likes, comments and shares and how often each array is searched.</w:t>
+      </w:r>
+    </w:p>
+    <w:p>
+      <w:pPr>
+        <w:shd w:val="clear" w:color="auto" w:fill="FFFFFF"/>
+        <w:spacing w:after="0" w:line="240" w:lineRule="auto"/>
+        <w:rPr>
+          <w:rFonts w:ascii="Open Sans" w:eastAsia="Times New Roman" w:hAnsi="Open Sans" w:cs="Open Sans"/>
+          <w:color w:val="222222"/>
+          <w:kern w:val="0"/>
+          <w:sz w:val="23"/>
+          <w:szCs w:val="23"/>
+          <w14:ligatures w14:val="none"/>
+        </w:rPr>
+      </w:pPr>
+    </w:p>
+    <w:p>
+      <w:pPr>
+        <w:shd w:val="clear" w:color="auto" w:fill="FFFFFF"/>
+        <w:spacing w:after="0" w:line="240" w:lineRule="auto"/>
+        <w:rPr>
+          <w:rFonts w:ascii="Open Sans" w:eastAsia="Times New Roman" w:hAnsi="Open Sans" w:cs="Open Sans"/>
+          <w:color w:val="222222"/>
+          <w:kern w:val="0"/>
+          <w:sz w:val="23"/>
+          <w:szCs w:val="23"/>
+          <w14:ligatures w14:val="none"/>
+        </w:rPr>
+      </w:pPr>
+      <w:r>
+        <w:rPr>
+          <w:rFonts w:ascii="Open Sans" w:eastAsia="Times New Roman" w:hAnsi="Open Sans" w:cs="Open Sans"/>
+          <w:color w:val="222222"/>
+          <w:kern w:val="0"/>
+          <w:sz w:val="23"/>
+          <w:szCs w:val="23"/>
+          <w14:ligatures w14:val="none"/>
+        </w:rPr>
+        <w:t>(l-1) *l / 2 + l*(c + s) + c*(log</w:t>
+      </w:r>
+      <w:r>
+        <w:rPr>
+          <w:rFonts w:ascii="Open Sans" w:eastAsia="Times New Roman" w:hAnsi="Open Sans" w:cs="Open Sans"/>
+          <w:color w:val="222222"/>
+          <w:kern w:val="0"/>
+          <w:sz w:val="23"/>
+          <w:szCs w:val="23"/>
+          <w:vertAlign w:val="subscript"/>
+          <w14:ligatures w14:val="none"/>
+        </w:rPr>
+        <w:t>2</w:t>
+      </w:r>
+      <w:r>
+        <w:rPr>
+          <w:rFonts w:ascii="Open Sans" w:eastAsia="Times New Roman" w:hAnsi="Open Sans" w:cs="Open Sans"/>
+          <w:color w:val="222222"/>
+          <w:kern w:val="0"/>
+          <w:sz w:val="23"/>
+          <w:szCs w:val="23"/>
+          <w14:ligatures w14:val="none"/>
+        </w:rPr>
+        <w:t>l + s) + s*(log</w:t>
+      </w:r>
+      <w:r>
+        <w:rPr>
+          <w:rFonts w:ascii="Open Sans" w:eastAsia="Times New Roman" w:hAnsi="Open Sans" w:cs="Open Sans"/>
+          <w:color w:val="222222"/>
+          <w:kern w:val="0"/>
+          <w:sz w:val="23"/>
+          <w:szCs w:val="23"/>
+          <w:vertAlign w:val="subscript"/>
+          <w14:ligatures w14:val="none"/>
+        </w:rPr>
+        <w:t>2</w:t>
+      </w:r>
+      <w:r>
+        <w:rPr>
+          <w:rFonts w:ascii="Open Sans" w:eastAsia="Times New Roman" w:hAnsi="Open Sans" w:cs="Open Sans"/>
+          <w:color w:val="222222"/>
+          <w:kern w:val="0"/>
+          <w:sz w:val="23"/>
+          <w:szCs w:val="23"/>
+          <w14:ligatures w14:val="none"/>
+        </w:rPr>
+        <w:t xml:space="preserve">l+c) </w:t>
+      </w:r>
+    </w:p>
+    <w:p>
+      <w:pPr>
+        <w:shd w:val="clear" w:color="auto" w:fill="FFFFFF"/>
+        <w:spacing w:after="0" w:line="240" w:lineRule="auto"/>
+        <w:rPr>
+          <w:rFonts w:ascii="Open Sans" w:eastAsia="Times New Roman" w:hAnsi="Open Sans" w:cs="Open Sans"/>
+          <w:color w:val="222222"/>
+          <w:kern w:val="0"/>
+          <w:sz w:val="23"/>
+          <w:szCs w:val="23"/>
+          <w14:ligatures w14:val="none"/>
+        </w:rPr>
+      </w:pPr>
+      <w:r>
+        <w:rPr>
+          <w:rFonts w:ascii="Open Sans" w:eastAsia="Times New Roman" w:hAnsi="Open Sans" w:cs="Open Sans"/>
+          <w:color w:val="222222"/>
+          <w:kern w:val="0"/>
+          <w:sz w:val="23"/>
+          <w:szCs w:val="23"/>
+          <w14:ligatures w14:val="none"/>
+        </w:rPr>
+        <w:t>= l</w:t>
+      </w:r>
+      <w:r>
+        <w:rPr>
+          <w:rFonts w:ascii="Open Sans" w:eastAsia="Times New Roman" w:hAnsi="Open Sans" w:cs="Open Sans"/>
+          <w:color w:val="222222"/>
+          <w:kern w:val="0"/>
+          <w:sz w:val="23"/>
+          <w:szCs w:val="23"/>
+          <w:vertAlign w:val="superscript"/>
+          <w14:ligatures w14:val="none"/>
+        </w:rPr>
+        <w:t>2</w:t>
+      </w:r>
+      <w:r>
+        <w:rPr>
+          <w:rFonts w:ascii="Open Sans" w:eastAsia="Times New Roman" w:hAnsi="Open Sans" w:cs="Open Sans"/>
+          <w:color w:val="222222"/>
+          <w:kern w:val="0"/>
+          <w:sz w:val="23"/>
+          <w:szCs w:val="23"/>
+          <w14:ligatures w14:val="none"/>
+        </w:rPr>
+        <w:t>/2 – l/2 + l*c + l*s + 2 * c*s + (</w:t>
+      </w:r>
+      <w:proofErr w:type="spellStart"/>
+      <w:r>
+        <w:rPr>
+          <w:rFonts w:ascii="Open Sans" w:eastAsia="Times New Roman" w:hAnsi="Open Sans" w:cs="Open Sans"/>
+          <w:color w:val="222222"/>
+          <w:kern w:val="0"/>
+          <w:sz w:val="23"/>
+          <w:szCs w:val="23"/>
+          <w14:ligatures w14:val="none"/>
+        </w:rPr>
+        <w:t>c+</w:t>
+      </w:r>
+      <w:proofErr w:type="gramStart"/>
+      <w:r>
+        <w:rPr>
+          <w:rFonts w:ascii="Open Sans" w:eastAsia="Times New Roman" w:hAnsi="Open Sans" w:cs="Open Sans"/>
+          <w:color w:val="222222"/>
+          <w:kern w:val="0"/>
+          <w:sz w:val="23"/>
+          <w:szCs w:val="23"/>
+          <w14:ligatures w14:val="none"/>
+        </w:rPr>
+        <w:t>s</w:t>
+      </w:r>
+      <w:proofErr w:type="spellEnd"/>
+      <w:r>
+        <w:rPr>
+          <w:rFonts w:ascii="Open Sans" w:eastAsia="Times New Roman" w:hAnsi="Open Sans" w:cs="Open Sans"/>
+          <w:color w:val="222222"/>
+          <w:kern w:val="0"/>
+          <w:sz w:val="23"/>
+          <w:szCs w:val="23"/>
+          <w14:ligatures w14:val="none"/>
+        </w:rPr>
+        <w:t>)*</w:t>
+      </w:r>
+      <w:proofErr w:type="gramEnd"/>
+      <w:r>
+        <w:rPr>
+          <w:rFonts w:ascii="Open Sans" w:eastAsia="Times New Roman" w:hAnsi="Open Sans" w:cs="Open Sans"/>
+          <w:color w:val="222222"/>
+          <w:kern w:val="0"/>
+          <w:sz w:val="23"/>
+          <w:szCs w:val="23"/>
+          <w14:ligatures w14:val="none"/>
+        </w:rPr>
+        <w:t>log</w:t>
+      </w:r>
+      <w:r>
+        <w:rPr>
+          <w:rFonts w:ascii="Open Sans" w:eastAsia="Times New Roman" w:hAnsi="Open Sans" w:cs="Open Sans"/>
+          <w:color w:val="222222"/>
+          <w:kern w:val="0"/>
+          <w:sz w:val="23"/>
+          <w:szCs w:val="23"/>
+          <w:vertAlign w:val="subscript"/>
+          <w14:ligatures w14:val="none"/>
+        </w:rPr>
+        <w:t>2</w:t>
+      </w:r>
+      <w:r>
+        <w:rPr>
+          <w:rFonts w:ascii="Open Sans" w:eastAsia="Times New Roman" w:hAnsi="Open Sans" w:cs="Open Sans"/>
+          <w:color w:val="222222"/>
+          <w:kern w:val="0"/>
+          <w:sz w:val="23"/>
+          <w:szCs w:val="23"/>
+          <w14:ligatures w14:val="none"/>
+        </w:rPr>
+        <w:t xml:space="preserve">l </w:t>
+      </w:r>
+    </w:p>
+    <w:p>
+      <w:pPr>
+        <w:shd w:val="clear" w:color="auto" w:fill="FFFFFF"/>
+        <w:spacing w:after="0" w:line="240" w:lineRule="auto"/>
+        <w:rPr>
+          <w:rFonts w:ascii="Open Sans" w:eastAsia="Times New Roman" w:hAnsi="Open Sans" w:cs="Open Sans"/>
+          <w:color w:val="222222"/>
+          <w:kern w:val="0"/>
+          <w:sz w:val="23"/>
+          <w:szCs w:val="23"/>
+          <w14:ligatures w14:val="none"/>
+        </w:rPr>
+      </w:pPr>
+      <w:r>
+        <w:rPr>
+          <w:rFonts w:ascii="Open Sans" w:eastAsia="Times New Roman" w:hAnsi="Open Sans" w:cs="Open Sans"/>
+          <w:color w:val="222222"/>
+          <w:kern w:val="0"/>
+          <w:sz w:val="23"/>
+          <w:szCs w:val="23"/>
+          <w14:ligatures w14:val="none"/>
+        </w:rPr>
+        <w:t>=</w:t>
+      </w:r>
+      <w:r>
+        <w:rPr>
+          <w:rFonts w:ascii="Open Sans" w:eastAsia="Times New Roman" w:hAnsi="Open Sans" w:cs="Open Sans"/>
+          <w:color w:val="222222"/>
+          <w:kern w:val="0"/>
+          <w:sz w:val="23"/>
+          <w:szCs w:val="23"/>
+          <w14:ligatures w14:val="none"/>
+        </w:rPr>
+        <w:t xml:space="preserve"> </w:t>
+      </w:r>
+      <w:r>
+        <w:rPr>
+          <w:rFonts w:ascii="Open Sans" w:eastAsia="Times New Roman" w:hAnsi="Open Sans" w:cs="Open Sans"/>
+          <w:color w:val="222222"/>
+          <w:kern w:val="0"/>
+          <w:sz w:val="23"/>
+          <w:szCs w:val="23"/>
+          <w14:ligatures w14:val="none"/>
+        </w:rPr>
+        <w:t>l</w:t>
+      </w:r>
+      <w:r>
+        <w:rPr>
+          <w:rFonts w:ascii="Open Sans" w:eastAsia="Times New Roman" w:hAnsi="Open Sans" w:cs="Open Sans"/>
+          <w:color w:val="222222"/>
+          <w:kern w:val="0"/>
+          <w:sz w:val="23"/>
+          <w:szCs w:val="23"/>
+          <w:vertAlign w:val="superscript"/>
+          <w14:ligatures w14:val="none"/>
+        </w:rPr>
+        <w:t>2</w:t>
+      </w:r>
+      <w:r>
+        <w:rPr>
+          <w:rFonts w:ascii="Open Sans" w:eastAsia="Times New Roman" w:hAnsi="Open Sans" w:cs="Open Sans"/>
+          <w:color w:val="222222"/>
+          <w:kern w:val="0"/>
+          <w:sz w:val="23"/>
+          <w:szCs w:val="23"/>
+          <w14:ligatures w14:val="none"/>
+        </w:rPr>
+        <w:t>/2 – l/2 + 2 * c*s + (</w:t>
+      </w:r>
+      <w:proofErr w:type="spellStart"/>
+      <w:r>
+        <w:rPr>
+          <w:rFonts w:ascii="Open Sans" w:eastAsia="Times New Roman" w:hAnsi="Open Sans" w:cs="Open Sans"/>
+          <w:color w:val="222222"/>
+          <w:kern w:val="0"/>
+          <w:sz w:val="23"/>
+          <w:szCs w:val="23"/>
+          <w14:ligatures w14:val="none"/>
+        </w:rPr>
+        <w:t>c+</w:t>
+      </w:r>
+      <w:proofErr w:type="gramStart"/>
+      <w:r>
+        <w:rPr>
+          <w:rFonts w:ascii="Open Sans" w:eastAsia="Times New Roman" w:hAnsi="Open Sans" w:cs="Open Sans"/>
+          <w:color w:val="222222"/>
+          <w:kern w:val="0"/>
+          <w:sz w:val="23"/>
+          <w:szCs w:val="23"/>
+          <w14:ligatures w14:val="none"/>
+        </w:rPr>
+        <w:t>s</w:t>
+      </w:r>
+      <w:proofErr w:type="spellEnd"/>
+      <w:r>
+        <w:rPr>
+          <w:rFonts w:ascii="Open Sans" w:eastAsia="Times New Roman" w:hAnsi="Open Sans" w:cs="Open Sans"/>
+          <w:color w:val="222222"/>
+          <w:kern w:val="0"/>
+          <w:sz w:val="23"/>
+          <w:szCs w:val="23"/>
+          <w14:ligatures w14:val="none"/>
+        </w:rPr>
+        <w:t>)*</w:t>
+      </w:r>
+      <w:proofErr w:type="gramEnd"/>
+      <w:r>
+        <w:rPr>
+          <w:rFonts w:ascii="Open Sans" w:eastAsia="Times New Roman" w:hAnsi="Open Sans" w:cs="Open Sans"/>
+          <w:color w:val="222222"/>
+          <w:kern w:val="0"/>
+          <w:sz w:val="23"/>
+          <w:szCs w:val="23"/>
+          <w14:ligatures w14:val="none"/>
+        </w:rPr>
+        <w:t>(log</w:t>
+      </w:r>
+      <w:r>
+        <w:rPr>
+          <w:rFonts w:ascii="Open Sans" w:eastAsia="Times New Roman" w:hAnsi="Open Sans" w:cs="Open Sans"/>
+          <w:color w:val="222222"/>
+          <w:kern w:val="0"/>
+          <w:sz w:val="23"/>
+          <w:szCs w:val="23"/>
+          <w:vertAlign w:val="subscript"/>
+          <w14:ligatures w14:val="none"/>
+        </w:rPr>
+        <w:t>2</w:t>
+      </w:r>
+      <w:r>
+        <w:rPr>
+          <w:rFonts w:ascii="Open Sans" w:eastAsia="Times New Roman" w:hAnsi="Open Sans" w:cs="Open Sans"/>
+          <w:color w:val="222222"/>
+          <w:kern w:val="0"/>
+          <w:sz w:val="23"/>
+          <w:szCs w:val="23"/>
+          <w14:ligatures w14:val="none"/>
+        </w:rPr>
+        <w:t>l + l)</w:t>
+      </w:r>
+    </w:p>
+    <w:p>
+      <w:pPr>
+        <w:shd w:val="clear" w:color="auto" w:fill="FFFFFF"/>
+        <w:spacing w:after="0" w:line="240" w:lineRule="auto"/>
+        <w:rPr>
+          <w:rFonts w:ascii="Open Sans" w:eastAsia="Times New Roman" w:hAnsi="Open Sans" w:cs="Open Sans"/>
+          <w:color w:val="222222"/>
+          <w:kern w:val="0"/>
+          <w:sz w:val="23"/>
+          <w:szCs w:val="23"/>
+          <w14:ligatures w14:val="none"/>
+        </w:rPr>
+      </w:pPr>
+    </w:p>
+    <w:p>
+      <w:pPr>
+        <w:shd w:val="clear" w:color="auto" w:fill="FFFFFF"/>
+        <w:spacing w:after="0" w:line="240" w:lineRule="auto"/>
+        <w:rPr>
+          <w:rFonts w:ascii="Open Sans" w:eastAsia="Times New Roman" w:hAnsi="Open Sans" w:cs="Open Sans"/>
+          <w:color w:val="222222"/>
+          <w:kern w:val="0"/>
+          <w:sz w:val="23"/>
+          <w:szCs w:val="23"/>
+          <w14:ligatures w14:val="none"/>
+        </w:rPr>
+      </w:pPr>
+    </w:p>
+    <w:p>
+      <w:pPr>
+        <w:shd w:val="clear" w:color="auto" w:fill="FFFFFF"/>
+        <w:spacing w:after="0" w:line="240" w:lineRule="auto"/>
+        <w:rPr>
+          <w:rFonts w:ascii="Open Sans" w:eastAsia="Times New Roman" w:hAnsi="Open Sans" w:cs="Open Sans"/>
+          <w:color w:val="222222"/>
+          <w:kern w:val="0"/>
+          <w:sz w:val="23"/>
+          <w:szCs w:val="23"/>
+          <w14:ligatures w14:val="none"/>
+        </w:rPr>
+      </w:pPr>
+      <w:r>
+        <w:rPr>
+          <w:rFonts w:ascii="Open Sans" w:eastAsia="Times New Roman" w:hAnsi="Open Sans" w:cs="Open Sans"/>
+          <w:color w:val="222222"/>
+          <w:kern w:val="0"/>
+          <w:sz w:val="23"/>
+          <w:szCs w:val="23"/>
+          <w14:ligatures w14:val="none"/>
+        </w:rPr>
+        <w:t>The graph shows the measured execution time literally follows the same increasing trend as the estimated number of operations and theoretical complexity. As the input increases, all three lines grow at a similar quadratic rate</w:t>
+      </w:r>
+      <w:r>
+        <w:rPr>
+          <w:rFonts w:ascii="Open Sans" w:eastAsia="Times New Roman" w:hAnsi="Open Sans" w:cs="Open Sans"/>
+          <w:color w:val="222222"/>
+          <w:kern w:val="0"/>
+          <w:sz w:val="23"/>
+          <w:szCs w:val="23"/>
+          <w14:ligatures w14:val="none"/>
+        </w:rPr>
+        <w:t>.</w:t>
+      </w:r>
+    </w:p>
+    <w:p>
+      <w:pPr>
+        <w:shd w:val="clear" w:color="auto" w:fill="FFFFFF"/>
+        <w:spacing w:after="0" w:line="240" w:lineRule="auto"/>
+        <w:rPr>
+          <w:rFonts w:ascii="Open Sans" w:eastAsia="Times New Roman" w:hAnsi="Open Sans" w:cs="Open Sans"/>
+          <w:color w:val="222222"/>
+          <w:kern w:val="0"/>
+          <w:sz w:val="23"/>
+          <w:szCs w:val="23"/>
+          <w14:ligatures w14:val="none"/>
+        </w:rPr>
+      </w:pPr>
+    </w:p>
+    <w:p>
+      <w:pPr>
+        <w:shd w:val="clear" w:color="auto" w:fill="FFFFFF"/>
+        <w:spacing w:after="0" w:line="240" w:lineRule="auto"/>
+        <w:outlineLvl w:val="1"/>
+        <w:rPr>
+          <w:rFonts w:ascii="Open Sans" w:eastAsia="Times New Roman" w:hAnsi="Open Sans" w:cs="Open Sans"/>
+          <w:color w:val="222222"/>
+          <w:kern w:val="0"/>
+          <w:sz w:val="32"/>
+          <w:szCs w:val="32"/>
+          <w14:ligatures w14:val="none"/>
+        </w:rPr>
+      </w:pPr>
+      <w:r>
+        <w:rPr>
+          <w:rFonts w:ascii="Open Sans" w:eastAsia="Times New Roman" w:hAnsi="Open Sans" w:cs="Open Sans"/>
+          <w:color w:val="222222"/>
+          <w:kern w:val="0"/>
+          <w:sz w:val="32"/>
+          <w:szCs w:val="32"/>
+          <w14:ligatures w14:val="none"/>
+        </w:rPr>
         <w:t>Word Count</w:t>
       </w:r>
     </w:p>
@@ -3851,13 +4461,7 @@
         <w:t xml:space="preserve"> words.</w:t>
       </w:r>
     </w:p>
-    <w:p>
-      <w:pPr>
-        <w:rPr>
-          <w:rFonts w:hint="eastAsia"/>
-        </w:rPr>
-      </w:pPr>
-    </w:p>
+    <w:p/>
     <w:sectPr>
       <w:pgSz w:w="11906" w:h="16838"/>
       <w:pgMar w:top="1440" w:right="1440" w:bottom="1440" w:left="1440" w:header="708" w:footer="708" w:gutter="0"/>

</xml_diff>